<commit_message>
Refactor metadata and relationship pass reuse
</commit_message>
<xml_diff>
--- a/COMP3888_Music_Evidence_Evaluation_Program_Technical_Manual.docx
+++ b/COMP3888_Music_Evidence_Evaluation_Program_Technical_Manual.docx
@@ -226,7 +226,7 @@
                 <w:color w:val="000000"/>
                 <w:sz w:val="20"/>
               </w:rPr>
-              <w:t>6 October 2026</w:t>
+              <w:t>10 October 2026</w:t>
             </w:r>
           </w:p>
         </w:tc>
@@ -427,7 +427,7 @@
           <w:color w:val="000000"/>
           <w:sz w:val="21"/>
         </w:rPr>
-        <w:t>This manual describes how the V3 program validates a submitted music evidence graph, binds declared objects to files, runs parsing and assessment passes, and reports four separate assessment axes. Version 0.5.0 also runs eight bounded physical-audio diagnostics for alignment, source contribution, CompSheet selections, processed content, mix residuals, mastering continuity, excerpts, and possible decoy sources. The program continues evaluating valid evidence when an unknown non-final artefact type or an unknown relationship can be isolated. It never infers or silently corrects the submitter's semantic declarations.</w:t>
+        <w:t>This manual describes how the V3 program validates a submitted music evidence graph, binds declared objects to files, runs parsing and assessment passes, and reports four separate assessment axes. Version 0.5.0 also runs eight bounded physical-audio diagnostics for alignment, source contribution, CompSheet selections, processed content, mix residuals, mastering continuity, excerpts, and possible decoy sources. WavMetadataPass now produces reusable technical checks, and RelationshipIntegrityPass runs as a libevchain EvidencePass. The program continues evaluating valid evidence when an unknown non-final artefact type or an unknown relationship can be isolated. It never infers or silently corrects the submitter's semantic declarations.</w:t>
       </w:r>
     </w:p>
     <w:p>
@@ -8454,7 +8454,7 @@
           <w:color w:val="000000"/>
           <w:sz w:val="21"/>
         </w:rPr>
-        <w:t>The current program combines object-level libevchain passes with graph-level assessment classes. The Pipeline executes registered artefact and relationship passes. The engine then runs parsers, exact declared derivation checks, and eight bounded physical-audio diagnostics to produce axis values, checks, findings, and reasoning. Signal-estimated offsets, gains, and channel matrices are diagnostic only: they do not rewrite graph claims, create relationships, or become exact provenance proof.</w:t>
+        <w:t>The current program combines registered libevchain passes with graph-level assessment classes. The Pipeline executes WavMetadataPass once for each audio artefact and RelationshipIntegrityPass once for each retained relationship. BoundFileIntegrityPass and the integrity-axis assembler consume those cached checks instead of repeating the technical or edge comparisons. The engine then runs parsers, exact declared derivation checks, and eight bounded physical-audio diagnostics to produce axis values, checks, findings, and reasoning. Signal-estimated offsets, gains, and channel matrices remain diagnostic only and do not rewrite graph claims, create relationships, or become exact provenance proof.</w:t>
       </w:r>
     </w:p>
     <w:p>
@@ -8693,7 +8693,7 @@
                 <w:color w:val="000000"/>
                 <w:sz w:val="16"/>
               </w:rPr>
-              <w:t>Strict PCM structure, WAV metadata, and technical claim mismatches.</w:t>
+              <w:t>Strict PCM structure, WAV metadata, and standardised technical checks.</w:t>
             </w:r>
           </w:p>
         </w:tc>
@@ -8720,7 +8720,7 @@
                 <w:color w:val="000000"/>
                 <w:sz w:val="16"/>
               </w:rPr>
-              <w:t>Observation and reasoning; cached per artefact.</w:t>
+              <w:t>Observation, checks, and reasoning; cached per artefact.</w:t>
             </w:r>
           </w:p>
         </w:tc>
@@ -8753,7 +8753,7 @@
                 <w:color w:val="000000"/>
                 <w:sz w:val="16"/>
               </w:rPr>
-              <w:t>MusicRelationshipPass</w:t>
+              <w:t>RelationshipIntegrityPass</w:t>
             </w:r>
           </w:p>
         </w:tc>
@@ -8781,7 +8781,7 @@
                 <w:color w:val="000000"/>
                 <w:sz w:val="16"/>
               </w:rPr>
-              <w:t>Relationship</w:t>
+              <w:t>Relationship EvidencePass</w:t>
             </w:r>
           </w:p>
         </w:tc>
@@ -8809,7 +8809,7 @@
                 <w:color w:val="000000"/>
                 <w:sz w:val="16"/>
               </w:rPr>
-              <w:t>Endpoint observations and duration difference; reads both endpoint WAV results.</w:t>
+              <w:t>Declared time ranges, duration bounds, sample rate, and bit depth compared with cached endpoint observations.</w:t>
             </w:r>
           </w:p>
         </w:tc>
@@ -8837,7 +8837,7 @@
                 <w:color w:val="000000"/>
                 <w:sz w:val="16"/>
               </w:rPr>
-              <w:t>Relationship observation; cached per edge.</w:t>
+              <w:t>Observation, checks, and reasoning; cached per edge.</w:t>
             </w:r>
           </w:p>
         </w:tc>
@@ -8896,7 +8896,7 @@
                 <w:color w:val="000000"/>
                 <w:sz w:val="16"/>
               </w:rPr>
-              <w:t>Graph</w:t>
+              <w:t>Graph aggregation</w:t>
             </w:r>
           </w:p>
         </w:tc>
@@ -8923,7 +8923,7 @@
                 <w:color w:val="000000"/>
                 <w:sz w:val="16"/>
               </w:rPr>
-              <w:t>Object binding, technical claims, and parser failures.</w:t>
+              <w:t>Object binding, parser failures, and cached WavMetadataPass checks.</w:t>
             </w:r>
           </w:p>
         </w:tc>
@@ -8950,124 +8950,7 @@
                 <w:color w:val="000000"/>
                 <w:sz w:val="16"/>
               </w:rPr>
-              <w:t>Value, checks, findings; graph-level cache pending.</w:t>
-            </w:r>
-          </w:p>
-        </w:tc>
-      </w:tr>
-      <w:tr>
-        <w:trPr>
-          <w:cantSplit/>
-        </w:trPr>
-        <w:tc>
-          <w:tcPr>
-            <w:tcW w:type="dxa" w:w="2088"/>
-            <w:shd w:fill="EEF3F8"/>
-            <w:vAlign w:val="center"/>
-            <w:tcMar>
-              <w:top w:w="85" w:type="dxa"/>
-              <w:start w:w="110" w:type="dxa"/>
-              <w:bottom w:w="85" w:type="dxa"/>
-              <w:end w:w="110" w:type="dxa"/>
-            </w:tcMar>
-          </w:tcPr>
-          <w:p>
-            <w:pPr>
-              <w:spacing w:after="0" w:line="252" w:lineRule="auto"/>
-              <w:jc w:val="left"/>
-            </w:pPr>
-            <w:r>
-              <w:rPr>
-                <w:rFonts w:ascii="Arial" w:hAnsi="Arial" w:eastAsia="Arial"/>
-                <w:b/>
-                <w:color w:val="000000"/>
-                <w:sz w:val="16"/>
-              </w:rPr>
-              <w:t>RelationshipIntegrityPass</w:t>
-            </w:r>
-          </w:p>
-        </w:tc>
-        <w:tc>
-          <w:tcPr>
-            <w:tcW w:type="dxa" w:w="1512"/>
-            <w:shd w:fill="EEF3F8"/>
-            <w:vAlign w:val="center"/>
-            <w:tcMar>
-              <w:top w:w="85" w:type="dxa"/>
-              <w:start w:w="110" w:type="dxa"/>
-              <w:bottom w:w="85" w:type="dxa"/>
-              <w:end w:w="110" w:type="dxa"/>
-            </w:tcMar>
-          </w:tcPr>
-          <w:p>
-            <w:pPr>
-              <w:spacing w:after="0" w:line="252" w:lineRule="auto"/>
-              <w:jc w:val="left"/>
-            </w:pPr>
-            <w:r>
-              <w:rPr>
-                <w:rFonts w:ascii="Arial" w:hAnsi="Arial" w:eastAsia="Arial"/>
-                <w:b w:val="0"/>
-                <w:color w:val="000000"/>
-                <w:sz w:val="16"/>
-              </w:rPr>
-              <w:t>Graph</w:t>
-            </w:r>
-          </w:p>
-        </w:tc>
-        <w:tc>
-          <w:tcPr>
-            <w:tcW w:type="dxa" w:w="3960"/>
-            <w:shd w:fill="EEF3F8"/>
-            <w:vAlign w:val="center"/>
-            <w:tcMar>
-              <w:top w:w="85" w:type="dxa"/>
-              <w:start w:w="110" w:type="dxa"/>
-              <w:bottom w:w="85" w:type="dxa"/>
-              <w:end w:w="110" w:type="dxa"/>
-            </w:tcMar>
-          </w:tcPr>
-          <w:p>
-            <w:pPr>
-              <w:spacing w:after="0" w:line="252" w:lineRule="auto"/>
-              <w:jc w:val="left"/>
-            </w:pPr>
-            <w:r>
-              <w:rPr>
-                <w:rFonts w:ascii="Arial" w:hAnsi="Arial" w:eastAsia="Arial"/>
-                <w:b w:val="0"/>
-                <w:color w:val="000000"/>
-                <w:sz w:val="16"/>
-              </w:rPr>
-              <w:t>Time ranges, duration, sample rate, and bit-depth claims.</w:t>
-            </w:r>
-          </w:p>
-        </w:tc>
-        <w:tc>
-          <w:tcPr>
-            <w:tcW w:type="dxa" w:w="2664"/>
-            <w:shd w:fill="EEF3F8"/>
-            <w:vAlign w:val="center"/>
-            <w:tcMar>
-              <w:top w:w="85" w:type="dxa"/>
-              <w:start w:w="110" w:type="dxa"/>
-              <w:bottom w:w="85" w:type="dxa"/>
-              <w:end w:w="110" w:type="dxa"/>
-            </w:tcMar>
-          </w:tcPr>
-          <w:p>
-            <w:pPr>
-              <w:spacing w:after="0" w:line="252" w:lineRule="auto"/>
-              <w:jc w:val="left"/>
-            </w:pPr>
-            <w:r>
-              <w:rPr>
-                <w:rFonts w:ascii="Arial" w:hAnsi="Arial" w:eastAsia="Arial"/>
-                <w:b w:val="0"/>
-                <w:color w:val="000000"/>
-                <w:sz w:val="16"/>
-              </w:rPr>
-              <w:t>Value, checks, findings; graph-level cache pending.</w:t>
+              <w:t>Value, checks, and findings; WAV comparisons are not repeated.</w:t>
             </w:r>
           </w:p>
         </w:tc>
@@ -11180,7 +11063,7 @@
           <w:color w:val="000000"/>
           <w:sz w:val="21"/>
         </w:rPr>
-        <w:t>Artefact and Evidence objects cache results by Pass class. When MusicRelationshipPass requests WavMetadataPass for its source and target, an already computed result is returned instead of parsing the same WAV again. Each object also maintains a Pass call stack. If a Pass requests itself directly or through another Pass, the library raises CircularEvaluationException.</w:t>
+        <w:t>Artefact and Evidence objects cache results by Pass class. WavMetadataPass emits measured WAV data and standardised technical checks once per audio artefact. RelationshipIntegrityPass requests those cached results for its source and target, so it does not parse either WAV again. BoundFileIntegrityPass later reuses the same technical checks when it assembles the file-integrity layer. Each Artefact or Evidence object also maintains a Pass call stack. If a Pass requests itself directly or through another Pass, the library raises CircularEvaluationException.</w:t>
       </w:r>
     </w:p>
     <w:p>
@@ -11194,7 +11077,7 @@
           <w:color w:val="000000"/>
           <w:sz w:val="21"/>
         </w:rPr>
-        <w:t>This protection currently applies to object-level passes only. Type-specific parser outputs, graph indexes, decoded PCM, and graph-level assessments still need a shared evaluation context with request-scoped caching and cycle detection.</w:t>
+        <w:t>This protection applies to registered artefact and relationship passes. Type-specific parser outputs, graph indexes, decoded PCM, and the remaining graph-level assessments still need a shared evaluation context with request-scoped caching and cycle detection.</w:t>
       </w:r>
     </w:p>
     <w:p>
@@ -15208,7 +15091,7 @@
                 <w:color w:val="000000"/>
                 <w:sz w:val="16"/>
               </w:rPr>
-              <w:t>Binds files, validates WAV structure, executes the Pipeline, retains standalone checks after quarantine, and orchestrates assessments.</w:t>
+              <w:t>Binds files, validates WAV structure, runs WavMetadataPass and the relationship EvidencePass, retains standalone checks after quarantine, and orchestrates assessments.</w:t>
             </w:r>
           </w:p>
         </w:tc>
@@ -15267,7 +15150,7 @@
                 <w:color w:val="000000"/>
                 <w:sz w:val="16"/>
               </w:rPr>
-              <w:t>File, relationship, cross-evidence, C2PA attestation, AI disclosure, and integrity combination logic.</w:t>
+              <w:t>Aggregates cached file and relationship checks and runs CrossEvidence, C2PA attestation, AI disclosure, and integrity combination logic.</w:t>
             </w:r>
           </w:p>
         </w:tc>
@@ -21219,7 +21102,7 @@
                 <w:color w:val="000000"/>
                 <w:sz w:val="17"/>
               </w:rPr>
-              <w:t>MusicRelationshipPass, BoundFileIntegrityPass, RelationshipIntegrityPass, and ExpandedCrossEvidencePass.</w:t>
+              <w:t>RelationshipIntegrityPass, BoundFileIntegrityPass, and ExpandedCrossEvidencePass.</w:t>
             </w:r>
           </w:p>
         </w:tc>

</xml_diff>

<commit_message>
Isolate evaluation failures and scope C2PA checks
</commit_message>
<xml_diff>
--- a/COMP3888_Music_Evidence_Evaluation_Program_Technical_Manual.docx
+++ b/COMP3888_Music_Evidence_Evaluation_Program_Technical_Manual.docx
@@ -215,18 +215,8 @@
             </w:tcMar>
           </w:tcPr>
           <w:p>
-            <w:pPr>
-              <w:spacing w:after="0" w:line="252" w:lineRule="auto"/>
-              <w:jc w:val="left"/>
-            </w:pPr>
-            <w:r>
-              <w:rPr>
-                <w:rFonts w:ascii="Arial" w:hAnsi="Arial" w:eastAsia="Arial"/>
-                <w:b w:val="0"/>
-                <w:color w:val="000000"/>
-                <w:sz w:val="20"/>
-              </w:rPr>
-              <w:t>10 October 2026</w:t>
+            <w:r>
+              <w:t>11 October 2026</w:t>
             </w:r>
           </w:p>
         </w:tc>
@@ -394,18 +384,8 @@
             </w:tcMar>
           </w:tcPr>
           <w:p>
-            <w:pPr>
-              <w:spacing w:after="0" w:line="252" w:lineRule="auto"/>
-              <w:jc w:val="left"/>
-            </w:pPr>
-            <w:r>
-              <w:rPr>
-                <w:rFonts w:ascii="Arial" w:hAnsi="Arial" w:eastAsia="Arial"/>
-                <w:b w:val="0"/>
-                <w:color w:val="000000"/>
-                <w:sz w:val="20"/>
-              </w:rPr>
-              <w:t>65 tests passed, 0 failures, 0 errors</w:t>
+            <w:r>
+              <w:t>73 tests passed, 0 failures, 0 errors</w:t>
             </w:r>
           </w:p>
         </w:tc>
@@ -422,12 +402,7 @@
         <w:spacing w:after="120" w:line="274" w:lineRule="auto"/>
       </w:pPr>
       <w:r>
-        <w:rPr>
-          <w:rFonts w:ascii="Arial" w:hAnsi="Arial" w:eastAsia="Arial"/>
-          <w:color w:val="000000"/>
-          <w:sz w:val="21"/>
-        </w:rPr>
-        <w:t>This manual describes how the V3 program validates a submitted music evidence graph, binds declared objects to files, runs parsing and assessment passes, and reports four separate assessment axes. Version 0.5.0 also runs eight bounded physical-audio diagnostics for alignment, source contribution, CompSheet selections, processed content, mix residuals, mastering continuity, excerpts, and possible decoy sources. WavMetadataPass now produces reusable technical checks, and RelationshipIntegrityPass runs as a libevchain EvidencePass. The program continues evaluating valid evidence when an unknown non-final artefact type or an unknown relationship can be isolated. It never infers or silently corrects the submitter's semantic declarations.</w:t>
+        <w:t>This manual describes how the V3 program validates a submitted music evidence graph, binds declared objects to files, runs parsing and assessment passes, and reports four separate assessment axes. Version 0.5.0 also runs eight bounded physical-audio diagnostics for alignment, source contribution, CompSheet selections, processed content, mix residuals, mastering continuity, excerpts, and possible decoy sources. WavMetadataPass produces reusable technical checks, recognises integer-PCM WAVE_FORMAT_EXTENSIBLE, and isolates a non-final parser failure to dependent checks. RelationshipIntegrityPass runs as a libevchain EvidencePass. C2PA attestation is scoped to the final artefact, while supporting-node records remain separately visible. The program never infers or silently corrects the submitter's semantic declarations.</w:t>
       </w:r>
     </w:p>
     <w:p>
@@ -1661,12 +1636,7 @@
         <w:spacing w:after="120" w:line="274" w:lineRule="auto"/>
       </w:pPr>
       <w:r>
-        <w:rPr>
-          <w:rFonts w:ascii="Arial" w:hAnsi="Arial" w:eastAsia="Arial"/>
-          <w:color w:val="000000"/>
-          <w:sz w:val="21"/>
-        </w:rPr>
-        <w:t>The normalisation boundary separates local semantic problems from request-wide structural problems. A local problem is removed from the evaluation graph and reported. A structural problem stops the request because the program cannot interpret the graph reliably.</w:t>
+        <w:t>The normalisation boundary separates local semantic problems from request-wide structural problems. Unknown declarations that can be isolated are removed from the evaluation graph and reported. A known non-final WAV that cannot be parsed remains visible in the graph, but only WAV-dependent checks become unavailable. A structural problem, an unreadable final artefact, or an unsafe graph stops the request because the program cannot form a reliable evaluation root.</w:t>
       </w:r>
     </w:p>
     <w:tbl>
@@ -2039,6 +2009,38 @@
                 <w:sz w:val="16"/>
               </w:rPr>
               <w:t>RELATIONSHIP_ENDPOINTS_SKIPPED</w:t>
+            </w:r>
+          </w:p>
+        </w:tc>
+      </w:tr>
+      <w:tr>
+        <w:tc>
+          <w:tcPr>
+            <w:tcW w:type="dxa" w:w="3456"/>
+          </w:tcPr>
+          <w:p>
+            <w:r>
+              <w:t>Known non-final WAV cannot be parsed</w:t>
+            </w:r>
+          </w:p>
+        </w:tc>
+        <w:tc>
+          <w:tcPr>
+            <w:tcW w:type="dxa" w:w="3456"/>
+          </w:tcPr>
+          <w:p>
+            <w:r>
+              <w:t>Keep the node and declaration, record parser_failed, and skip only checks that require decoded WAV data.</w:t>
+            </w:r>
+          </w:p>
+        </w:tc>
+        <w:tc>
+          <w:tcPr>
+            <w:tcW w:type="dxa" w:w="3456"/>
+          </w:tcPr>
+          <w:p>
+            <w:r>
+              <w:t>execution_status succeeded; WAV_PARSER_FAILED; dependent checks unavailable</w:t>
             </w:r>
           </w:p>
         </w:tc>
@@ -2329,6 +2331,7 @@
       <w:pPr>
         <w:pStyle w:val="Heading2"/>
         <w:keepNext/>
+        <w:pageBreakBefore/>
       </w:pPr>
       <w:r>
         <w:t>1 4 Design Principles</w:t>
@@ -7110,12 +7113,7 @@
         <w:spacing w:after="120" w:line="274" w:lineRule="auto"/>
       </w:pPr>
       <w:r>
-        <w:rPr>
-          <w:rFonts w:ascii="Arial" w:hAnsi="Arial" w:eastAsia="Arial"/>
-          <w:color w:val="000000"/>
-          <w:sz w:val="21"/>
-        </w:rPr>
-        <w:t>The objects map binds a declared SHA-256 digest to a bundle-relative path. A permitted suffix does not determine the artefact type. The evaluator resolves the path inside the supplied root, checks file size, recalculates the digest, and then dispatches a parser from the submitter's type.</w:t>
+        <w:t>The objects map binds a declared SHA-256 digest to a bundle-relative path. A permitted suffix does not determine the artefact type. The evaluator resolves the path inside the supplied root, checks file size, calculates the digest once, binds the verified file directly, and then dispatches a parser from the submitter's type.</w:t>
       </w:r>
     </w:p>
     <w:tbl>
@@ -7353,18 +7351,8 @@
             </w:tcMar>
           </w:tcPr>
           <w:p>
-            <w:pPr>
-              <w:spacing w:after="0" w:line="252" w:lineRule="auto"/>
-              <w:jc w:val="left"/>
-            </w:pPr>
-            <w:r>
-              <w:rPr>
-                <w:rFonts w:ascii="Arial" w:hAnsi="Arial" w:eastAsia="Arial"/>
-                <w:b w:val="0"/>
-                <w:color w:val="000000"/>
-                <w:sz w:val="17"/>
-              </w:rPr>
-              <w:t>RIFF bounds, integer PCM framing, channels, rate, bit depth, data length, and declared technical fields.</w:t>
+            <w:r>
+              <w:t>RIFF bounds, integer PCM including the extensible PCM SubFormat, channels, rate, bit depth, data length, and declared technical fields. A non-final parser failure is isolated; the final remains strict.</w:t>
             </w:r>
           </w:p>
         </w:tc>
@@ -8160,18 +8148,8 @@
             </w:tcMar>
           </w:tcPr>
           <w:p>
-            <w:pPr>
-              <w:spacing w:after="0" w:line="252" w:lineRule="auto"/>
-              <w:jc w:val="left"/>
-            </w:pPr>
-            <w:r>
-              <w:rPr>
-                <w:rFonts w:ascii="Arial" w:hAnsi="Arial" w:eastAsia="Arial"/>
-                <w:b w:val="0"/>
-                <w:color w:val="000000"/>
-                <w:sz w:val="17"/>
-              </w:rPr>
-              <w:t>Requires c2pa-python; distinguishes SDK, reader, manifest, and validation states.</w:t>
+            <w:r>
+              <w:t>Requires c2pa-python; distinguishes SDK, reader, manifest, and validation states. Embedded and standalone records are bound to graph assets before cross-checking.</w:t>
             </w:r>
           </w:p>
         </w:tc>
@@ -8449,12 +8427,7 @@
         <w:spacing w:after="120" w:line="274" w:lineRule="auto"/>
       </w:pPr>
       <w:r>
-        <w:rPr>
-          <w:rFonts w:ascii="Arial" w:hAnsi="Arial" w:eastAsia="Arial"/>
-          <w:color w:val="000000"/>
-          <w:sz w:val="21"/>
-        </w:rPr>
-        <w:t>The current program combines registered libevchain passes with graph-level assessment classes. The Pipeline executes WavMetadataPass once for each audio artefact and RelationshipIntegrityPass once for each retained relationship. BoundFileIntegrityPass and the integrity-axis assembler consume those cached checks instead of repeating the technical or edge comparisons. The engine then runs parsers, exact declared derivation checks, and eight bounded physical-audio diagnostics to produce axis values, checks, findings, and reasoning. Signal-estimated offsets, gains, and channel matrices remain diagnostic only and do not rewrite graph claims, create relationships, or become exact provenance proof.</w:t>
+        <w:t>The current program combines registered libevchain passes with graph-level assessment classes. The Pipeline executes WavMetadataPass once for each audio artefact and RelationshipIntegrityPass once for each retained relationship. BoundFileIntegrityPass and the integrity-axis assembler consume those cached checks instead of repeating the technical or edge comparisons. A non-final WAV parser failure is recorded as WAV_PARSER_FAILED and causes dependent physical-audio checks to skip that node. The engine then runs other parsers, exact declared derivation checks, and eight bounded physical-audio diagnostics to produce axis values, checks, findings, and reasoning. Signal-estimated offsets, gains, and channel matrices remain diagnostic only and do not rewrite graph claims, create relationships, or become exact provenance proof.</w:t>
       </w:r>
     </w:p>
     <w:p>
@@ -8682,18 +8655,8 @@
             </w:tcMar>
           </w:tcPr>
           <w:p>
-            <w:pPr>
-              <w:spacing w:after="0" w:line="252" w:lineRule="auto"/>
-              <w:jc w:val="left"/>
-            </w:pPr>
-            <w:r>
-              <w:rPr>
-                <w:rFonts w:ascii="Arial" w:hAnsi="Arial" w:eastAsia="Arial"/>
-                <w:b w:val="0"/>
-                <w:color w:val="000000"/>
-                <w:sz w:val="16"/>
-              </w:rPr>
-              <w:t>Strict PCM structure, WAV metadata, and standardised technical checks.</w:t>
+            <w:r>
+              <w:t>Strict integer PCM structure, extensible PCM SubFormat, WAV metadata, and standardised technical checks; non-final failures become parser_failed.</w:t>
             </w:r>
           </w:p>
         </w:tc>
@@ -8912,18 +8875,8 @@
             </w:tcMar>
           </w:tcPr>
           <w:p>
-            <w:pPr>
-              <w:spacing w:after="0" w:line="252" w:lineRule="auto"/>
-              <w:jc w:val="left"/>
-            </w:pPr>
-            <w:r>
-              <w:rPr>
-                <w:rFonts w:ascii="Arial" w:hAnsi="Arial" w:eastAsia="Arial"/>
-                <w:b w:val="0"/>
-                <w:color w:val="000000"/>
-                <w:sz w:val="16"/>
-              </w:rPr>
-              <w:t>Object binding, parser failures, and cached WavMetadataPass checks.</w:t>
+            <w:r>
+              <w:t>Object binding, parser failures, and cached WavMetadataPass checks; unavailable checks are excluded from the numeric denominator.</w:t>
             </w:r>
           </w:p>
         </w:tc>
@@ -9025,18 +8978,8 @@
             </w:tcMar>
           </w:tcPr>
           <w:p>
-            <w:pPr>
-              <w:spacing w:after="0" w:line="252" w:lineRule="auto"/>
-              <w:jc w:val="left"/>
-            </w:pPr>
-            <w:r>
-              <w:rPr>
-                <w:rFonts w:ascii="Arial" w:hAnsi="Arial" w:eastAsia="Arial"/>
-                <w:b w:val="0"/>
-                <w:color w:val="000000"/>
-                <w:sz w:val="16"/>
-              </w:rPr>
-              <w:t>RIN, ERN, MIDI, sheets, C2PA ingredients, contributor, identifier, and AI claim consistency.</w:t>
+            <w:r>
+              <w:t>RIN, ERN, MIDI, sheets, embedded and standalone C2PA ingredients, contributor, identifier, and AI claim consistency; bad optional field types are isolated per check.</w:t>
             </w:r>
           </w:p>
         </w:tc>
@@ -9228,18 +9171,8 @@
             </w:tcMar>
           </w:tcPr>
           <w:p>
-            <w:pPr>
-              <w:spacing w:after="0" w:line="252" w:lineRule="auto"/>
-              <w:jc w:val="left"/>
-            </w:pPr>
-            <w:r>
-              <w:rPr>
-                <w:rFonts w:ascii="Arial" w:hAnsi="Arial" w:eastAsia="Arial"/>
-                <w:b w:val="0"/>
-                <w:color w:val="000000"/>
-                <w:sz w:val="16"/>
-              </w:rPr>
-              <w:t>Graph</w:t>
+            <w:r>
+              <w:t>Final artefact plus per-record reporting</w:t>
             </w:r>
           </w:p>
         </w:tc>
@@ -9255,18 +9188,8 @@
             </w:tcMar>
           </w:tcPr>
           <w:p>
-            <w:pPr>
-              <w:spacing w:after="0" w:line="252" w:lineRule="auto"/>
-              <w:jc w:val="left"/>
-            </w:pPr>
-            <w:r>
-              <w:rPr>
-                <w:rFonts w:ascii="Arial" w:hAnsi="Arial" w:eastAsia="Arial"/>
-                <w:b w:val="0"/>
-                <w:color w:val="000000"/>
-                <w:sz w:val="16"/>
-              </w:rPr>
-              <w:t>Manifest, signature, validation state, and credential trust.</w:t>
+            <w:r>
+              <w:t>Final-bound manifest, signature, validation state, and credential trust; supporting records are reported separately.</w:t>
             </w:r>
           </w:p>
         </w:tc>
@@ -9282,18 +9205,8 @@
             </w:tcMar>
           </w:tcPr>
           <w:p>
-            <w:pPr>
-              <w:spacing w:after="0" w:line="252" w:lineRule="auto"/>
-              <w:jc w:val="left"/>
-            </w:pPr>
-            <w:r>
-              <w:rPr>
-                <w:rFonts w:ascii="Arial" w:hAnsi="Arial" w:eastAsia="Arial"/>
-                <w:b w:val="0"/>
-                <w:color w:val="000000"/>
-                <w:sz w:val="16"/>
-              </w:rPr>
-              <w:t>Attestation axis and validation fields.</w:t>
+            <w:r>
+              <w:t>Final-scoped axis, validation fields, and per-record C2PA reports.</w:t>
             </w:r>
           </w:p>
         </w:tc>
@@ -10461,12 +10374,7 @@
         <w:spacing w:after="120" w:line="274" w:lineRule="auto"/>
       </w:pPr>
       <w:r>
-        <w:rPr>
-          <w:rFonts w:ascii="Arial" w:hAnsi="Arial" w:eastAsia="Arial"/>
-          <w:color w:val="000000"/>
-          <w:sz w:val="21"/>
-        </w:rPr>
-        <w:t>parse_bound_artefacts is currently an orchestration function rather than a registered Pass. It selects a parser from the declared artefact type, records parser status and data, and passes failures to later assessments. It does not infer a type from the file.</w:t>
+        <w:t>parse_bound_artefacts is currently an orchestration function rather than a registered Pass. It selects a parser from the declared artefact type, records parser status and data, and passes failures to later assessments. WAV parsing reuses WavMetadataPass status; unsupported non-final WAVs are not decoded again. It does not infer a type from the file.</w:t>
       </w:r>
     </w:p>
     <w:tbl>
@@ -10592,18 +10500,8 @@
             </w:tcMar>
           </w:tcPr>
           <w:p>
-            <w:pPr>
-              <w:spacing w:after="0" w:line="252" w:lineRule="auto"/>
-              <w:jc w:val="left"/>
-            </w:pPr>
-            <w:r>
-              <w:rPr>
-                <w:rFonts w:ascii="Arial" w:hAnsi="Arial" w:eastAsia="Arial"/>
-                <w:b w:val="0"/>
-                <w:color w:val="000000"/>
-                <w:sz w:val="17"/>
-              </w:rPr>
-              <w:t>Reuse WavMetadataPass observations and attempt embedded C2PA reading.</w:t>
+            <w:r>
+              <w:t>Reuse WavMetadataPass observations and status; attempt embedded C2PA reading. A non-final parser failure is not retried.</w:t>
             </w:r>
           </w:p>
         </w:tc>
@@ -10952,18 +10850,8 @@
             </w:tcMar>
           </w:tcPr>
           <w:p>
-            <w:pPr>
-              <w:spacing w:after="0" w:line="252" w:lineRule="auto"/>
-              <w:jc w:val="left"/>
-            </w:pPr>
-            <w:r>
-              <w:rPr>
-                <w:rFonts w:ascii="Arial" w:hAnsi="Arial" w:eastAsia="Arial"/>
-                <w:b w:val="0"/>
-                <w:color w:val="000000"/>
-                <w:sz w:val="17"/>
-              </w:rPr>
-              <w:t>Run the standalone C2PA parser.</w:t>
+            <w:r>
+              <w:t>Run the standalone C2PA parser, bind the record to its adjacent graph asset, and include it in ingredient cross-checks.</w:t>
             </w:r>
           </w:p>
         </w:tc>
@@ -11058,12 +10946,7 @@
         <w:spacing w:after="120" w:line="274" w:lineRule="auto"/>
       </w:pPr>
       <w:r>
-        <w:rPr>
-          <w:rFonts w:ascii="Arial" w:hAnsi="Arial" w:eastAsia="Arial"/>
-          <w:color w:val="000000"/>
-          <w:sz w:val="21"/>
-        </w:rPr>
-        <w:t>Artefact and Evidence objects cache results by Pass class. WavMetadataPass emits measured WAV data and standardised technical checks once per audio artefact. RelationshipIntegrityPass requests those cached results for its source and target, so it does not parse either WAV again. BoundFileIntegrityPass later reuses the same technical checks when it assembles the file-integrity layer. Each Artefact or Evidence object also maintains a Pass call stack. If a Pass requests itself directly or through another Pass, the library raises CircularEvaluationException.</w:t>
+        <w:t>Artefact and Evidence objects cache results by Pass class. WavMetadataPass emits measured WAV data and standardised technical checks once per audio artefact. RelationshipIntegrityPass requests those cached results for its source and target, so it does not parse either WAV again. BoundFileIntegrityPass later reuses the same technical checks when it assembles the file-integrity layer. Verified object hashes are reused during binding, and source_revision is cached once per process. Each Artefact or Evidence object also maintains a Pass call stack. If a Pass requests itself directly or through another Pass, the library raises CircularEvaluationException.</w:t>
       </w:r>
     </w:p>
     <w:p>
@@ -11966,12 +11849,7 @@
         <w:spacing w:after="120" w:line="274" w:lineRule="auto"/>
       </w:pPr>
       <w:r>
-        <w:rPr>
-          <w:rFonts w:ascii="Arial" w:hAnsi="Arial" w:eastAsia="Arial"/>
-          <w:color w:val="000000"/>
-          <w:sz w:val="21"/>
-        </w:rPr>
-        <w:t>Integrity measures consistency among bound files, technical declarations, relationship parameters, cross-evidence records, and explicitly scoped declared derivations. The new physical-audio diagnostics may corroborate, contradict, or flag a claim for review, but their estimated parameters do not add exact integrity credit. Integrity does not authenticate the creator.</w:t>
+        <w:t>Integrity measures consistency among bound files, technical declarations, relationship parameters, cross-evidence records, and explicitly scoped declared derivations. A malformed optional comparison field makes only that check unavailable; it does not fail unrelated checks. The physical-audio diagnostics may corroborate, contradict, or flag a claim for review, but their estimated parameters do not add exact integrity credit. Integrity does not authenticate the creator.</w:t>
       </w:r>
     </w:p>
     <w:tbl>
@@ -12126,18 +12004,8 @@
             </w:tcMar>
           </w:tcPr>
           <w:p>
-            <w:pPr>
-              <w:spacing w:after="0" w:line="252" w:lineRule="auto"/>
-              <w:jc w:val="left"/>
-            </w:pPr>
-            <w:r>
-              <w:rPr>
-                <w:rFonts w:ascii="Arial" w:hAnsi="Arial" w:eastAsia="Arial"/>
-                <w:b w:val="0"/>
-                <w:color w:val="000000"/>
-                <w:sz w:val="17"/>
-              </w:rPr>
-              <w:t>Passed checks divided by all assessed checks</w:t>
+            <w:r>
+              <w:t>Passed checks divided by assessed Boolean checks; unavailable checks are excluded</w:t>
             </w:r>
           </w:p>
         </w:tc>
@@ -12478,18 +12346,8 @@
             </w:tcMar>
           </w:tcPr>
           <w:p>
-            <w:pPr>
-              <w:spacing w:after="0" w:line="252" w:lineRule="auto"/>
-              <w:jc w:val="left"/>
-            </w:pPr>
-            <w:r>
-              <w:rPr>
-                <w:rFonts w:ascii="Arial" w:hAnsi="Arial" w:eastAsia="Arial"/>
-                <w:b w:val="0"/>
-                <w:color w:val="000000"/>
-                <w:sz w:val="17"/>
-              </w:rPr>
-              <w:t>Corroborated checks divided by all assessed checks</w:t>
+            <w:r>
+              <w:t>Corroborated checks divided by assessed Boolean checks; malformed optional comparisons are unavailable</w:t>
             </w:r>
           </w:p>
         </w:tc>
@@ -12506,18 +12364,8 @@
             </w:tcMar>
           </w:tcPr>
           <w:p>
-            <w:pPr>
-              <w:spacing w:after="0" w:line="252" w:lineRule="auto"/>
-              <w:jc w:val="left"/>
-            </w:pPr>
-            <w:r>
-              <w:rPr>
-                <w:rFonts w:ascii="Arial" w:hAnsi="Arial" w:eastAsia="Arial"/>
-                <w:b w:val="0"/>
-                <w:color w:val="000000"/>
-                <w:sz w:val="17"/>
-              </w:rPr>
-              <w:t>RIN, ERN, MIDI, sheets, C2PA ingredients, and declared graph data.</w:t>
+            <w:r>
+              <w:t>RIN, ERN, MIDI, sheets, embedded and standalone C2PA ingredients, and declared graph data.</w:t>
             </w:r>
           </w:p>
         </w:tc>
@@ -12595,18 +12443,8 @@
             </w:tcMar>
           </w:tcPr>
           <w:p>
-            <w:pPr>
-              <w:spacing w:after="0" w:line="252" w:lineRule="auto"/>
-              <w:jc w:val="left"/>
-            </w:pPr>
-            <w:r>
-              <w:rPr>
-                <w:rFonts w:ascii="Arial" w:hAnsi="Arial" w:eastAsia="Arial"/>
-                <w:b w:val="0"/>
-                <w:color w:val="000000"/>
-                <w:sz w:val="17"/>
-              </w:rPr>
-              <w:t>C2PA manifest, signature, validation state, and credential trust.</w:t>
+            <w:r>
+              <w:t>Only C2PA records bound to the final artefact affect the axis; supporting records remain visible.</w:t>
             </w:r>
           </w:p>
         </w:tc>
@@ -12654,12 +12492,7 @@
         <w:spacing w:after="120" w:line="274" w:lineRule="auto"/>
       </w:pPr>
       <w:r>
-        <w:rPr>
-          <w:rFonts w:ascii="Arial" w:hAnsi="Arial" w:eastAsia="Arial"/>
-          <w:color w:val="000000"/>
-          <w:sz w:val="21"/>
-        </w:rPr>
-        <w:t>Attestation strength reports the available C2PA manifest, signature, SDK validation, and credential trust state. It measures cryptographic provenance strength and does not establish that every semantic claim in a manifest is true.</w:t>
+        <w:t>Attestation strength reports the C2PA manifest, signature, SDK validation, and credential trust state bound to the final artefact. Supporting-node and standalone manifests are listed separately in c2pa_attestation_records and cannot raise the top-level axis. Embedded and standalone ingredient hashes and relationships are normalised and cross-checked against the submitted graph. The axis measures cryptographic provenance strength and does not establish that every semantic claim in a manifest is true.</w:t>
       </w:r>
     </w:p>
     <w:tbl>
@@ -12787,6 +12620,23 @@
             </w:tcMar>
           </w:tcPr>
           <w:p>
+            <w:r>
+              <w:t>SDK unavailable or no final-bound record</w:t>
+            </w:r>
+          </w:p>
+        </w:tc>
+        <w:tc>
+          <w:tcPr>
+            <w:tcW w:type="dxa" w:w="3096"/>
+            <w:vAlign w:val="center"/>
+            <w:tcMar>
+              <w:top w:w="85" w:type="dxa"/>
+              <w:start w:w="110" w:type="dxa"/>
+              <w:bottom w:w="85" w:type="dxa"/>
+              <w:end w:w="110" w:type="dxa"/>
+            </w:tcMar>
+          </w:tcPr>
+          <w:p>
             <w:pPr>
               <w:spacing w:after="0" w:line="252" w:lineRule="auto"/>
               <w:jc w:val="left"/>
@@ -12798,33 +12648,6 @@
                 <w:color w:val="000000"/>
                 <w:sz w:val="17"/>
               </w:rPr>
-              <w:t>SDK unavailable or no record</w:t>
-            </w:r>
-          </w:p>
-        </w:tc>
-        <w:tc>
-          <w:tcPr>
-            <w:tcW w:type="dxa" w:w="3096"/>
-            <w:vAlign w:val="center"/>
-            <w:tcMar>
-              <w:top w:w="85" w:type="dxa"/>
-              <w:start w:w="110" w:type="dxa"/>
-              <w:bottom w:w="85" w:type="dxa"/>
-              <w:end w:w="110" w:type="dxa"/>
-            </w:tcMar>
-          </w:tcPr>
-          <w:p>
-            <w:pPr>
-              <w:spacing w:after="0" w:line="252" w:lineRule="auto"/>
-              <w:jc w:val="left"/>
-            </w:pPr>
-            <w:r>
-              <w:rPr>
-                <w:rFonts w:ascii="Arial" w:hAnsi="Arial" w:eastAsia="Arial"/>
-                <w:b w:val="0"/>
-                <w:color w:val="000000"/>
-                <w:sz w:val="17"/>
-              </w:rPr>
               <w:t>unavailable, null</w:t>
             </w:r>
           </w:p>
@@ -12841,18 +12664,8 @@
             </w:tcMar>
           </w:tcPr>
           <w:p>
-            <w:pPr>
-              <w:spacing w:after="0" w:line="252" w:lineRule="auto"/>
-              <w:jc w:val="left"/>
-            </w:pPr>
-            <w:r>
-              <w:rPr>
-                <w:rFonts w:ascii="Arial" w:hAnsi="Arial" w:eastAsia="Arial"/>
-                <w:b w:val="0"/>
-                <w:color w:val="000000"/>
-                <w:sz w:val="17"/>
-              </w:rPr>
-              <w:t>Cryptographic attestation was not assessed.</w:t>
+            <w:r>
+              <w:t>Cryptographic attestation of the final artefact was not assessed; supporting records cannot raise the axis.</w:t>
             </w:r>
           </w:p>
         </w:tc>
@@ -13016,18 +12829,8 @@
             </w:tcMar>
           </w:tcPr>
           <w:p>
-            <w:pPr>
-              <w:spacing w:after="0" w:line="252" w:lineRule="auto"/>
-              <w:jc w:val="left"/>
-            </w:pPr>
-            <w:r>
-              <w:rPr>
-                <w:rFonts w:ascii="Arial" w:hAnsi="Arial" w:eastAsia="Arial"/>
-                <w:b w:val="0"/>
-                <w:color w:val="000000"/>
-                <w:sz w:val="17"/>
-              </w:rPr>
-              <w:t>The reader confirmed no usable active manifest.</w:t>
+            <w:r>
+              <w:t>The reader confirmed no usable active manifest for the final artefact.</w:t>
             </w:r>
           </w:p>
         </w:tc>
@@ -13105,18 +12908,8 @@
             </w:tcMar>
           </w:tcPr>
           <w:p>
-            <w:pPr>
-              <w:spacing w:after="0" w:line="252" w:lineRule="auto"/>
-              <w:jc w:val="left"/>
-            </w:pPr>
-            <w:r>
-              <w:rPr>
-                <w:rFonts w:ascii="Arial" w:hAnsi="Arial" w:eastAsia="Arial"/>
-                <w:b w:val="0"/>
-                <w:color w:val="000000"/>
-                <w:sz w:val="17"/>
-              </w:rPr>
-              <w:t>The SDK reported invalid validation state.</w:t>
+            <w:r>
+              <w:t>The SDK reported an invalid validation state for the final artefact.</w:t>
             </w:r>
           </w:p>
         </w:tc>
@@ -13191,18 +12984,8 @@
             </w:tcMar>
           </w:tcPr>
           <w:p>
-            <w:pPr>
-              <w:spacing w:after="0" w:line="252" w:lineRule="auto"/>
-              <w:jc w:val="left"/>
-            </w:pPr>
-            <w:r>
-              <w:rPr>
-                <w:rFonts w:ascii="Arial" w:hAnsi="Arial" w:eastAsia="Arial"/>
-                <w:b w:val="0"/>
-                <w:color w:val="000000"/>
-                <w:sz w:val="17"/>
-              </w:rPr>
-              <w:t>Cryptographically valid; trust was not reported.</w:t>
+            <w:r>
+              <w:t>The final artefact is cryptographically valid; credential trust was not reported.</w:t>
             </w:r>
           </w:p>
         </w:tc>
@@ -13280,18 +13063,8 @@
             </w:tcMar>
           </w:tcPr>
           <w:p>
-            <w:pPr>
-              <w:spacing w:after="0" w:line="252" w:lineRule="auto"/>
-              <w:jc w:val="left"/>
-            </w:pPr>
-            <w:r>
-              <w:rPr>
-                <w:rFonts w:ascii="Arial" w:hAnsi="Arial" w:eastAsia="Arial"/>
-                <w:b w:val="0"/>
-                <w:color w:val="000000"/>
-                <w:sz w:val="17"/>
-              </w:rPr>
-              <w:t>Cryptographically valid and credential trusted.</w:t>
+            <w:r>
+              <w:t>The final artefact is cryptographically valid and its credential is trusted.</w:t>
             </w:r>
           </w:p>
         </w:tc>
@@ -13437,7 +13210,7 @@
       <w:pPr>
         <w:pStyle w:val="Heading2"/>
         <w:keepNext/>
-        <w:pageBreakBefore w:val="0"/>
+        <w:pageBreakBefore/>
         <w:spacing w:before="160" w:after="80"/>
       </w:pPr>
       <w:r>
@@ -13893,18 +13666,8 @@
             </w:tcMar>
           </w:tcPr>
           <w:p>
-            <w:pPr>
-              <w:spacing w:after="0" w:line="252" w:lineRule="auto"/>
-              <w:jc w:val="left"/>
-            </w:pPr>
-            <w:r>
-              <w:rPr>
-                <w:rFonts w:ascii="Arial" w:hAnsi="Arial" w:eastAsia="Arial"/>
-                <w:b w:val="0"/>
-                <w:color w:val="000000"/>
-                <w:sz w:val="16"/>
-              </w:rPr>
-              <w:t>Preserves cryptographic validation details.</w:t>
+            <w:r>
+              <w:t>Preserves final-scoped cryptographic validation details.</w:t>
             </w:r>
           </w:p>
         </w:tc>
@@ -13952,18 +13715,8 @@
             </w:tcMar>
           </w:tcPr>
           <w:p>
-            <w:pPr>
-              <w:spacing w:after="0" w:line="252" w:lineRule="auto"/>
-              <w:jc w:val="left"/>
-            </w:pPr>
-            <w:r>
-              <w:rPr>
-                <w:rFonts w:ascii="Arial" w:hAnsi="Arial" w:eastAsia="Arial"/>
-                <w:b w:val="0"/>
-                <w:color w:val="000000"/>
-                <w:sz w:val="16"/>
-              </w:rPr>
-              <w:t>Checks grouped by assessment component, including audio_alignment, source_contribution, comp_verification, processed_audio_match, stem_mix_residual, mastering_derivation, excerpted_from, and decoy_source</w:t>
+            <w:r>
+              <w:t>Checks grouped by assessment component, including cross_evidence, c2pa_attestation_records, audio_alignment, source_contribution, comp_verification, processed_audio_match, stem_mix_residual, mastering_derivation, excerpted_from, and decoy_source</w:t>
             </w:r>
           </w:p>
         </w:tc>
@@ -13979,18 +13732,8 @@
             </w:tcMar>
           </w:tcPr>
           <w:p>
-            <w:pPr>
-              <w:spacing w:after="0" w:line="252" w:lineRule="auto"/>
-              <w:jc w:val="left"/>
-            </w:pPr>
-            <w:r>
-              <w:rPr>
-                <w:rFonts w:ascii="Arial" w:hAnsi="Arial" w:eastAsia="Arial"/>
-                <w:b w:val="0"/>
-                <w:color w:val="000000"/>
-                <w:sz w:val="16"/>
-              </w:rPr>
-              <w:t>Exposes individual rules, statuses, hashes, declared versus estimated parameter sources, residuals, similarity, ambiguity, and diagnostics.</w:t>
+            <w:r>
+              <w:t>Exposes individual rules, unavailable states, C2PA record scope and binding, hashes, declared versus estimated parameter sources, residuals, similarity, ambiguity, and diagnostics.</w:t>
             </w:r>
           </w:p>
         </w:tc>
@@ -14960,18 +14703,8 @@
             </w:tcMar>
           </w:tcPr>
           <w:p>
-            <w:pPr>
-              <w:spacing w:after="0" w:line="252" w:lineRule="auto"/>
-              <w:jc w:val="left"/>
-            </w:pPr>
-            <w:r>
-              <w:rPr>
-                <w:rFonts w:ascii="Arial" w:hAnsi="Arial" w:eastAsia="Arial"/>
-                <w:b w:val="0"/>
-                <w:color w:val="000000"/>
-                <w:sz w:val="16"/>
-              </w:rPr>
-              <w:t>Reads and validates requests, adapts CSEC input, quarantines local semantic errors, records coverage and unknown inputs, and builds response identity.</w:t>
+            <w:r>
+              <w:t>Reads and validates requests, adapts CSEC input, quarantines local semantic errors, records coverage and unknown inputs, caches source_revision, and builds response identity.</w:t>
             </w:r>
           </w:p>
         </w:tc>
@@ -15080,18 +14813,8 @@
             </w:tcMar>
           </w:tcPr>
           <w:p>
-            <w:pPr>
-              <w:spacing w:after="0" w:line="252" w:lineRule="auto"/>
-              <w:jc w:val="left"/>
-            </w:pPr>
-            <w:r>
-              <w:rPr>
-                <w:rFonts w:ascii="Arial" w:hAnsi="Arial" w:eastAsia="Arial"/>
-                <w:b w:val="0"/>
-                <w:color w:val="000000"/>
-                <w:sz w:val="16"/>
-              </w:rPr>
-              <w:t>Binds files, validates WAV structure, runs WavMetadataPass and the relationship EvidencePass, retains standalone checks after quarantine, and orchestrates assessments.</w:t>
+            <w:r>
+              <w:t>Hashes and binds files once, validates integer PCM and WAVE_FORMAT_EXTENSIBLE, isolates non-final WAV parser failures, runs WavMetadataPass and the relationship EvidencePass, and orchestrates assessments.</w:t>
             </w:r>
           </w:p>
         </w:tc>
@@ -15139,18 +14862,8 @@
             </w:tcMar>
           </w:tcPr>
           <w:p>
-            <w:pPr>
-              <w:spacing w:after="0" w:line="252" w:lineRule="auto"/>
-              <w:jc w:val="left"/>
-            </w:pPr>
-            <w:r>
-              <w:rPr>
-                <w:rFonts w:ascii="Arial" w:hAnsi="Arial" w:eastAsia="Arial"/>
-                <w:b w:val="0"/>
-                <w:color w:val="000000"/>
-                <w:sz w:val="16"/>
-              </w:rPr>
-              <w:t>Aggregates cached file and relationship checks and runs CrossEvidence, C2PA attestation, AI disclosure, and integrity combination logic.</w:t>
+            <w:r>
+              <w:t>Aggregates cached file and relationship checks, isolates malformed optional comparisons, normalises standalone and embedded C2PA records, and runs final-scoped attestation, AI disclosure, and integrity combination logic.</w:t>
             </w:r>
           </w:p>
         </w:tc>
@@ -18010,18 +17723,8 @@
             </w:tcMar>
           </w:tcPr>
           <w:p>
-            <w:pPr>
-              <w:spacing w:after="0" w:line="252" w:lineRule="auto"/>
-              <w:jc w:val="left"/>
-            </w:pPr>
-            <w:r>
-              <w:rPr>
-                <w:rFonts w:ascii="Arial" w:hAnsi="Arial" w:eastAsia="Arial"/>
-                <w:b w:val="0"/>
-                <w:color w:val="000000"/>
-                <w:sz w:val="16"/>
-              </w:rPr>
-              <w:t>65 unit and end-to-end tests, including quarantine, partial coverage, graph safety, WAV, workflows, MIDI, sheets, DDEX, C2PA, AI, declared derivation, physical-audio diagnostics, integrity layers, and status semantics.</w:t>
+            <w:r>
+              <w:t>73 unit and end-to-end tests, including quarantine, non-final WAV isolation, extensible PCM, graph safety, workflows, MIDI, sheets, DDEX, final-scoped and standalone C2PA, hash caching, declared derivation, physical-audio diagnostics, integrity layers, and status semantics.</w:t>
             </w:r>
           </w:p>
         </w:tc>
@@ -18311,18 +18014,8 @@
             </w:tcMar>
           </w:tcPr>
           <w:p>
-            <w:pPr>
-              <w:spacing w:after="0" w:line="252" w:lineRule="auto"/>
-              <w:jc w:val="left"/>
-            </w:pPr>
-            <w:r>
-              <w:rPr>
-                <w:rFonts w:ascii="Arial" w:hAnsi="Arial" w:eastAsia="Arial"/>
-                <w:b w:val="0"/>
-                <w:color w:val="000000"/>
-                <w:sz w:val="16"/>
-              </w:rPr>
-              <w:t>Executed checks for version 0.5.0, including 65 passing tests and remaining calibration gaps.</w:t>
+            <w:r>
+              <w:t>Historical version 0.5.0 verification snapshot with 65 passing tests and remaining calibration gaps; the current working-tree suite has 73 passing tests.</w:t>
             </w:r>
           </w:p>
         </w:tc>
@@ -20356,18 +20049,8 @@
             </w:tcMar>
           </w:tcPr>
           <w:p>
-            <w:pPr>
-              <w:spacing w:after="0" w:line="252" w:lineRule="auto"/>
-              <w:jc w:val="left"/>
-            </w:pPr>
-            <w:r>
-              <w:rPr>
-                <w:rFonts w:ascii="Arial" w:hAnsi="Arial" w:eastAsia="Arial"/>
-                <w:b w:val="0"/>
-                <w:color w:val="000000"/>
-                <w:sz w:val="15"/>
-              </w:rPr>
-              <w:t>The current 65 tests and all new tests reproduce from a clean environment.</w:t>
+            <w:r>
+              <w:t>The current 73 tests and all new tests reproduce from a clean environment.</w:t>
             </w:r>
           </w:p>
         </w:tc>
@@ -20955,7 +20638,7 @@
       <w:pPr>
         <w:pStyle w:val="Heading2"/>
         <w:keepNext/>
-        <w:pageBreakBefore w:val="0"/>
+        <w:pageBreakBefore/>
         <w:spacing w:before="160" w:after="80"/>
       </w:pPr>
       <w:r>

</xml_diff>

<commit_message>
Add local tamper detection and bounded PCM window processing
</commit_message>
<xml_diff>
--- a/COMP3888_Music_Evidence_Evaluation_Program_Technical_Manual.docx
+++ b/COMP3888_Music_Evidence_Evaluation_Program_Technical_Manual.docx
@@ -385,7 +385,7 @@
           </w:tcPr>
           <w:p>
             <w:r>
-              <w:t>73 tests passed, 0 failures, 0 errors</w:t>
+              <w:t>77 tests passed, 0 failures, 0 errors</w:t>
             </w:r>
           </w:p>
         </w:tc>
@@ -402,7 +402,7 @@
         <w:spacing w:after="120" w:line="274" w:lineRule="auto"/>
       </w:pPr>
       <w:r>
-        <w:t>This manual describes how the V3 program validates a submitted music evidence graph, binds declared objects to files, runs parsing and assessment passes, and reports four separate assessment axes. Version 0.5.0 also runs eight bounded physical-audio diagnostics for alignment, source contribution, CompSheet selections, processed content, mix residuals, mastering continuity, excerpts, and possible decoy sources. WavMetadataPass produces reusable technical checks, recognises integer-PCM WAVE_FORMAT_EXTENSIBLE, and isolates a non-final parser failure to dependent checks. RelationshipIntegrityPass runs as a libevchain EvidencePass. C2PA attestation is scoped to the final artefact, while supporting-node records remain separately visible. The program never infers or silently corrects the submitter's semantic declarations.</w:t>
+        <w:t>This manual describes how the V3 program validates a submitted music evidence graph, binds declared objects to files, runs parsing and assessment passes, and reports four separate assessment axes. Version 0.5.0 also runs eight bounded physical-audio diagnostics for alignment, source contribution, CompSheet selections, processed content, mix residuals, mastering continuity, excerpts, and possible decoy sources. WavMetadataPass produces reusable technical checks, recognises integer-PCM WAVE_FORMAT_EXTENSIBLE, and isolates a non-final parser failure to dependent checks. RelationshipIntegrityPass runs as a libevchain EvidencePass. Exact audio checks now seek to declared ranges beyond 60 seconds, report sustained high-energy local mismatch intervals, calculate Master duration from complete file metadata, and reuse chunk-decoded packed PCM windows under a request-level memory budget. C2PA attestation is scoped to the final artefact, while supporting-node records remain separately visible. The program never infers or silently corrects the submitter's semantic declarations.</w:t>
       </w:r>
     </w:p>
     <w:p>
@@ -2760,18 +2760,8 @@
             </w:tcMar>
           </w:tcPr>
           <w:p>
-            <w:pPr>
-              <w:spacing w:after="0" w:line="252" w:lineRule="auto"/>
-              <w:jc w:val="left"/>
-            </w:pPr>
-            <w:r>
-              <w:rPr>
-                <w:rFonts w:ascii="Arial" w:hAnsi="Arial" w:eastAsia="Arial"/>
-                <w:b w:val="0"/>
-                <w:color w:val="000000"/>
-                <w:sz w:val="16"/>
-              </w:rPr>
-              <w:t>File and request limits, bounded decoding, downsampling, search and source-count caps, and constrained DTW keep analysis predictable; every parser treats input as untrusted.</w:t>
+            <w:r>
+              <w:t>File and request limits, chunked packed-PCM decoding, a 256 MiB request cache budget, declared-range seeking, bounded exploratory downsampling, search and source-count caps, and constrained DTW keep analysis predictable; every parser treats input as untrusted.</w:t>
             </w:r>
           </w:p>
         </w:tc>
@@ -8396,12 +8386,7 @@
         <w:spacing w:after="120" w:line="274" w:lineRule="auto"/>
       </w:pPr>
       <w:r>
-        <w:rPr>
-          <w:rFonts w:ascii="Arial" w:hAnsi="Arial" w:eastAsia="Arial"/>
-          <w:color w:val="000000"/>
-          <w:sz w:val="21"/>
-        </w:rPr>
-        <w:t>Resource limits are 32 MiB per file and 128 MiB in total for one evaluation. The final artefact must have a present, hash-matched file. Missing non-final mappings are reported as findings, while traversal outside the bundle root and SHA-256 mismatches are errors.</w:t>
+        <w:t>Resource limits are 32 MiB per file and 128 MiB in total for one evaluation. Decoded PCM windows use a separate 256 MiB request-level cache budget. Exact declared ranges are read directly in chunks, while exploratory searches retain a 60-second bound. The final artefact must have a present, hash-matched file. Missing non-final mappings are reported as findings, while traversal outside the bundle root and SHA-256 mismatches are errors.</w:t>
       </w:r>
     </w:p>
     <w:p>
@@ -8427,7 +8412,7 @@
         <w:spacing w:after="120" w:line="274" w:lineRule="auto"/>
       </w:pPr>
       <w:r>
-        <w:t>The current program combines registered libevchain passes with graph-level assessment classes. The Pipeline executes WavMetadataPass once for each audio artefact and RelationshipIntegrityPass once for each retained relationship. BoundFileIntegrityPass and the integrity-axis assembler consume those cached checks instead of repeating the technical or edge comparisons. A non-final WAV parser failure is recorded as WAV_PARSER_FAILED and causes dependent physical-audio checks to skip that node. The engine then runs other parsers, exact declared derivation checks, and eight bounded physical-audio diagnostics to produce axis values, checks, findings, and reasoning. Signal-estimated offsets, gains, and channel matrices remain diagnostic only and do not rewrite graph claims, create relationships, or become exact provenance proof.</w:t>
+        <w:t>The current program combines registered libevchain passes with graph-level assessment classes. The Pipeline executes WavMetadataPass once for each audio artefact and RelationshipIntegrityPass once for each retained relationship. BoundFileIntegrityPass and the integrity-axis assembler consume those cached checks instead of repeating the technical or edge comparisons. A non-final WAV parser failure is recorded as WAV_PARSER_FAILED and causes dependent physical-audio checks to skip that node. The engine then runs other parsers, exact declared derivation checks, and eight bounded physical-audio diagnostics to produce axis values, checks, findings, and reasoning. Exact Edit, Comp, Stem, and Mix checks retain block locations and report a contradiction when consecutive non-silent blocks exceed the local residual threshold for at least 0.20 seconds. Signal-estimated offsets, gains, and channel matrices remain diagnostic only and do not rewrite graph claims, create relationships, or become exact provenance proof.</w:t>
       </w:r>
     </w:p>
     <w:p>
@@ -9084,18 +9069,8 @@
             </w:tcMar>
           </w:tcPr>
           <w:p>
-            <w:pPr>
-              <w:spacing w:after="0" w:line="252" w:lineRule="auto"/>
-              <w:jc w:val="left"/>
-            </w:pPr>
-            <w:r>
-              <w:rPr>
-                <w:rFonts w:ascii="Arial" w:hAnsi="Arial" w:eastAsia="Arial"/>
-                <w:b w:val="0"/>
-                <w:color w:val="000000"/>
-                <w:sz w:val="16"/>
-              </w:rPr>
-              <w:t>Exact declared crop, placement, CompSheet, gain, fade, stem, and mix models; conservative declared-range Master continuity.</w:t>
+            <w:r>
+              <w:t>Exact declared crop, placement, CompSheet, gain, fade, stem, and mix models; timed sustained-local-mismatch detection; conservative declared-range Master continuity using complete-file duration metadata.</w:t>
             </w:r>
           </w:p>
         </w:tc>
@@ -9112,18 +9087,8 @@
             </w:tcMar>
           </w:tcPr>
           <w:p>
-            <w:pPr>
-              <w:spacing w:after="0" w:line="252" w:lineRule="auto"/>
-              <w:jc w:val="left"/>
-            </w:pPr>
-            <w:r>
-              <w:rPr>
-                <w:rFonts w:ascii="Arial" w:hAnsi="Arial" w:eastAsia="Arial"/>
-                <w:b w:val="0"/>
-                <w:color w:val="000000"/>
-                <w:sz w:val="16"/>
-              </w:rPr>
-              <w:t>matched, contradicted, corroborated, not_applicable, or unavailable; exact and weaker evidence remain distinct.</w:t>
+            <w:r>
+              <w:t>matched, contradicted, corroborated, not_applicable, or unavailable; local contradictions include mismatch time ranges; exact and weaker evidence remain distinct.</w:t>
             </w:r>
           </w:p>
         </w:tc>
@@ -10946,7 +10911,7 @@
         <w:spacing w:after="120" w:line="274" w:lineRule="auto"/>
       </w:pPr>
       <w:r>
-        <w:t>Artefact and Evidence objects cache results by Pass class. WavMetadataPass emits measured WAV data and standardised technical checks once per audio artefact. RelationshipIntegrityPass requests those cached results for its source and target, so it does not parse either WAV again. BoundFileIntegrityPass later reuses the same technical checks when it assembles the file-integrity layer. Verified object hashes are reused during binding, and source_revision is cached once per process. Each Artefact or Evidence object also maintains a Pass call stack. If a Pass requests itself directly or through another Pass, the library raises CircularEvaluationException.</w:t>
+        <w:t>Artefact and Evidence objects cache results by Pass class. WavMetadataPass emits measured WAV data and standardised technical checks once per audio artefact. RelationshipIntegrityPass requests those cached results for its source and target, so it does not parse either WAV again. BoundFileIntegrityPass later reuses the same technical checks when it assembles the file-integrity layer. Verified object hashes are reused during binding, source_revision is cached once per process, and decoded PCM is cached per request by artefact and time window. Each Artefact or Evidence object also maintains a Pass call stack. If a Pass requests itself directly or through another Pass, the library raises CircularEvaluationException.</w:t>
       </w:r>
     </w:p>
     <w:p>
@@ -10955,12 +10920,7 @@
         <w:spacing w:after="120" w:line="274" w:lineRule="auto"/>
       </w:pPr>
       <w:r>
-        <w:rPr>
-          <w:rFonts w:ascii="Arial" w:hAnsi="Arial" w:eastAsia="Arial"/>
-          <w:color w:val="000000"/>
-          <w:sz w:val="21"/>
-        </w:rPr>
-        <w:t>This protection applies to registered artefact and relationship passes. Type-specific parser outputs, graph indexes, decoded PCM, and the remaining graph-level assessments still need a shared evaluation context with request-scoped caching and cycle detection.</w:t>
+        <w:t>This protection applies to registered artefact and relationship passes. PCM window reuse is request-scoped and does not leak between evaluations. Type-specific parser outputs, graph indexes, and the remaining graph-level assessments still need a shared evaluation context with request-scoped caching and cycle detection.</w:t>
       </w:r>
     </w:p>
     <w:p>
@@ -14913,18 +14873,8 @@
             </w:tcMar>
           </w:tcPr>
           <w:p>
-            <w:pPr>
-              <w:spacing w:after="0" w:line="252" w:lineRule="auto"/>
-              <w:jc w:val="left"/>
-            </w:pPr>
-            <w:r>
-              <w:rPr>
-                <w:rFonts w:ascii="Arial" w:hAnsi="Arial" w:eastAsia="Arial"/>
-                <w:b w:val="0"/>
-                <w:color w:val="000000"/>
-                <w:sz w:val="16"/>
-              </w:rPr>
-              <w:t>Exact declared Edit, Comp, Stem, and Mix reconstruction plus conservative declared-range Master continuity.</w:t>
+            <w:r>
+              <w:t>Exact declared Edit, Comp, Stem, and Mix reconstruction with timed local-mismatch regions, declared-range PCM seeking, packed request-scoped PCM caching, and conservative Master continuity using complete-file durations.</w:t>
             </w:r>
           </w:p>
         </w:tc>
@@ -17724,7 +17674,7 @@
           </w:tcPr>
           <w:p>
             <w:r>
-              <w:t>73 unit and end-to-end tests, including quarantine, non-final WAV isolation, extensible PCM, graph safety, workflows, MIDI, sheets, DDEX, final-scoped and standalone C2PA, hash caching, declared derivation, physical-audio diagnostics, integrity layers, and status semantics.</w:t>
+              <w:t>77 unit and end-to-end tests, including quarantine, non-final WAV isolation, extensible PCM, graph safety, workflows, MIDI, sheets, DDEX, final-scoped and standalone C2PA, hash caching, local tampering, declared ranges beyond 60 seconds, full Master duration, and packed PCM caching.</w:t>
             </w:r>
           </w:p>
         </w:tc>
@@ -18015,7 +17965,7 @@
           </w:tcPr>
           <w:p>
             <w:r>
-              <w:t>Historical version 0.5.0 verification snapshot with 65 passing tests and remaining calibration gaps; the current working-tree suite has 73 passing tests.</w:t>
+              <w:t>Current version 0.5.0 verification snapshot with 77 passing tests and remaining calibration gaps.</w:t>
             </w:r>
           </w:p>
         </w:tc>
@@ -19331,18 +19281,8 @@
             </w:tcMar>
           </w:tcPr>
           <w:p>
-            <w:pPr>
-              <w:spacing w:after="0" w:line="252" w:lineRule="auto"/>
-              <w:jc w:val="left"/>
-            </w:pPr>
-            <w:r>
-              <w:rPr>
-                <w:rFonts w:ascii="Arial" w:hAnsi="Arial" w:eastAsia="Arial"/>
-                <w:b w:val="0"/>
-                <w:color w:val="000000"/>
-                <w:sz w:val="15"/>
-              </w:rPr>
-              <w:t>Add a request-scoped evaluation context for parsers, graph indexes, PCM decoding, and graph assessments.</w:t>
+            <w:r>
+              <w:t>Add a request-scoped evaluation context for parsers, graph indexes, and graph assessments; retain the implemented request-scoped PCM window cache.</w:t>
             </w:r>
           </w:p>
         </w:tc>
@@ -20050,7 +19990,7 @@
           </w:tcPr>
           <w:p>
             <w:r>
-              <w:t>The current 73 tests and all new tests reproduce from a clean environment.</w:t>
+              <w:t>The current 77 tests and all new tests reproduce from a clean environment.</w:t>
             </w:r>
           </w:p>
         </w:tc>
@@ -20927,18 +20867,8 @@
             </w:tcMar>
           </w:tcPr>
           <w:p>
-            <w:pPr>
-              <w:spacing w:after="0" w:line="252" w:lineRule="auto"/>
-              <w:jc w:val="left"/>
-            </w:pPr>
-            <w:r>
-              <w:rPr>
-                <w:rFonts w:ascii="Arial" w:hAnsi="Arial" w:eastAsia="Arial"/>
-                <w:b/>
-                <w:color w:val="000000"/>
-                <w:sz w:val="17"/>
-              </w:rPr>
-              <w:t>PCMAnalysisContext proposed</w:t>
+            <w:r>
+              <w:t>PCM window cache implemented</w:t>
             </w:r>
           </w:p>
         </w:tc>
@@ -20955,18 +20885,8 @@
             </w:tcMar>
           </w:tcPr>
           <w:p>
-            <w:pPr>
-              <w:spacing w:after="0" w:line="252" w:lineRule="auto"/>
-              <w:jc w:val="left"/>
-            </w:pPr>
-            <w:r>
-              <w:rPr>
-                <w:rFonts w:ascii="Arial" w:hAnsi="Arial" w:eastAsia="Arial"/>
-                <w:b w:val="0"/>
-                <w:color w:val="000000"/>
-                <w:sz w:val="17"/>
-              </w:rPr>
-              <w:t>Edit, Comp, Stem, Mix, and Master derivation classes plus all eight physical-audio diagnostics.</w:t>
+            <w:r>
+              <w:t>Edit, Comp, Stem, Mix, and Master derivation classes plus all eight physical-audio diagnostics; cache keys include artefact and decoded time window.</w:t>
             </w:r>
           </w:p>
         </w:tc>

</xml_diff>

<commit_message>
Isolate non-final input errors and stop on final-artefact problems
- Report input errors without correcting them; check the final artefact first and stop on any problem with it
- Isolate non-final hash mismatches, size-limit excess, invalid paths, hash/path format errors and unknown fields (with spelling suggestions)
- Re-evaluate once with a non-final file isolated if it changes during evaluation
- Raise object limits to 512 MiB / 1 GiB; remove the 60-second timeout cap; degrade audio checks before the deadline
- wav_io: detect AIFF/FLAC/Ogg/MP3 content, fix empty data chunk handling, cap decode blocks at 16 MiB
- Update READMEs, CSEC handoff, NEXT_TASKS, verification record and technical manual; 126 tests
</commit_message>
<xml_diff>
--- a/COMP3888_Music_Evidence_Evaluation_Program_Technical_Manual.docx
+++ b/COMP3888_Music_Evidence_Evaluation_Program_Technical_Manual.docx
@@ -216,7 +216,7 @@
           </w:tcPr>
           <w:p>
             <w:r>
-              <w:t>11 October 2026</w:t>
+              <w:t xml:space="preserve">13 October 2026</w:t>
             </w:r>
           </w:p>
         </w:tc>
@@ -385,7 +385,7 @@
           </w:tcPr>
           <w:p>
             <w:r>
-              <w:t>77 tests passed, 0 failures, 0 errors</w:t>
+              <w:t xml:space="preserve">126 tests passed, 0 failures, 0 errors</w:t>
             </w:r>
           </w:p>
         </w:tc>
@@ -402,7 +402,7 @@
         <w:spacing w:after="120" w:line="274" w:lineRule="auto"/>
       </w:pPr>
       <w:r>
-        <w:t>This manual describes how the V3 program validates a submitted music evidence graph, binds declared objects to files, runs parsing and assessment passes, and reports four separate assessment axes. Version 0.5.0 also runs eight bounded physical-audio diagnostics for alignment, source contribution, CompSheet selections, processed content, mix residuals, mastering continuity, excerpts, and possible decoy sources. WavMetadataPass produces reusable technical checks, recognises integer-PCM WAVE_FORMAT_EXTENSIBLE, and isolates a non-final parser failure to dependent checks. RelationshipIntegrityPass runs as a libevchain EvidencePass. Exact audio checks now seek to declared ranges beyond 60 seconds, report sustained high-energy local mismatch intervals, calculate Master duration from complete file metadata, and reuse chunk-decoded packed PCM windows under a request-level memory budget. C2PA attestation is scoped to the final artefact, while supporting-node records remain separately visible. The program never infers or silently corrects the submitter's semantic declarations.</w:t>
+        <w:t xml:space="preserve">This manual describes how the V3 program validates a submitted music evidence graph, binds declared objects to files, runs parsing and assessment passes, and reports four separate assessment axes. Version 0.5.0 also runs eight bounded physical-audio diagnostics for alignment, source contribution, CompSheet selections, processed content, mix residuals, mastering continuity, excerpts, and possible decoy sources. WavMetadataPass produces reusable technical checks, reads integer PCM and IEEE-float WAV, including WAVE_FORMAT_EXTENSIBLE, through a streaming reader, and isolates a non-final parser failure to dependent checks. RelationshipIntegrityPass runs as a libevchain EvidencePass. Exact audio checks seek to declared ranges anywhere in the file, report sustained high-energy local mismatch intervals, calculate Master duration from complete file metadata, and stream original-rate PCM as NumPy float32 blocks of about ten seconds; exploratory diagnostics search complete-file low-rate proxies under request-level memory and work budgets. C2PA attestation is scoped to the final artefact, while supporting-node records remain separately visible. The program never infers or silently corrects the submitter's semantic declarations.</w:t>
       </w:r>
     </w:p>
     <w:p>
@@ -1252,7 +1252,7 @@
                 <w:color w:val="000000"/>
                 <w:sz w:val="17"/>
               </w:rPr>
-              <w:t>Resolve bundle paths, block path escape, recalculate SHA-256, and enforce size limits.</w:t>
+              <w:t xml:space="preserve">Check the final object first and stop if it cannot be confirmed; then resolve, size-check and hash the other objects, isolating any that fail.</w:t>
             </w:r>
           </w:p>
         </w:tc>
@@ -1636,7 +1636,7 @@
         <w:spacing w:after="120" w:line="274" w:lineRule="auto"/>
       </w:pPr>
       <w:r>
-        <w:t>The normalisation boundary separates local semantic problems from request-wide structural problems. Unknown declarations that can be isolated are removed from the evaluation graph and reported. A known non-final WAV that cannot be parsed remains visible in the graph, but only WAV-dependent checks become unavailable. A structural problem, an unreadable final artefact, or an unsafe graph stops the request because the program cannot form a reliable evaluation root.</w:t>
+        <w:t xml:space="preserve">The normalisation boundary separates local semantic problems from request-wide structural problems. Unknown declarations that can be isolated are removed from the evaluation graph and reported. A known non-final WAV that cannot be parsed remains visible in the graph, but only WAV-dependent checks become unavailable. A structural problem, an unreadable final artefact, or an unsafe graph stops the request because the program cannot form a reliable evaluation root. Input errors are reported and never corrected: a problem with the final artefact stops the request and only that problem is reported, while a problem with another artefact or relationship makes only the checks that depend on it unavailable.</w:t>
       </w:r>
     </w:p>
     <w:tbl>
@@ -2073,6 +2073,362 @@
                 <w:color w:val="000000"/>
                 <w:sz w:val="16"/>
               </w:rPr>
+              <w:t xml:space="preserve">Final artefact file, hash, mapping, path or size cannot be confirmed</w:t>
+            </w:r>
+          </w:p>
+        </w:tc>
+        <w:tc>
+          <w:tcPr>
+            <w:tcW w:type="dxa" w:w="3528"/>
+            <w:shd w:fill="EEF3F8"/>
+            <w:vAlign w:val="center"/>
+            <w:tcMar>
+              <w:top w:w="85" w:type="dxa"/>
+              <w:start w:w="110" w:type="dxa"/>
+              <w:bottom w:w="85" w:type="dxa"/>
+              <w:end w:w="110" w:type="dxa"/>
+            </w:tcMar>
+          </w:tcPr>
+          <w:p>
+            <w:pPr>
+              <w:spacing w:after="0" w:line="252" w:lineRule="auto"/>
+              <w:jc w:val="left"/>
+            </w:pPr>
+            <w:r>
+              <w:rPr>
+                <w:rFonts w:ascii="Arial" w:hAnsi="Arial" w:eastAsia="Arial"/>
+                <w:b w:val="0"/>
+                <w:color w:val="000000"/>
+                <w:sz w:val="16"/>
+              </w:rPr>
+              <w:t xml:space="preserve">Stop at once; report only the final artefact's problem and do not check other objects.</w:t>
+            </w:r>
+          </w:p>
+        </w:tc>
+        <w:tc>
+          <w:tcPr>
+            <w:tcW w:type="dxa" w:w="4464"/>
+            <w:shd w:fill="EEF3F8"/>
+            <w:vAlign w:val="center"/>
+            <w:tcMar>
+              <w:top w:w="85" w:type="dxa"/>
+              <w:start w:w="110" w:type="dxa"/>
+              <w:bottom w:w="85" w:type="dxa"/>
+              <w:end w:w="110" w:type="dxa"/>
+            </w:tcMar>
+          </w:tcPr>
+          <w:p>
+            <w:pPr>
+              <w:spacing w:after="0" w:line="252" w:lineRule="auto"/>
+              <w:jc w:val="left"/>
+            </w:pPr>
+            <w:r>
+              <w:rPr>
+                <w:rFonts w:ascii="Arial" w:hAnsi="Arial" w:eastAsia="Arial"/>
+                <w:b w:val="0"/>
+                <w:color w:val="000000"/>
+                <w:sz w:val="16"/>
+              </w:rPr>
+              <w:t xml:space="preserve">execution_status error (unsupported for the size limit or an unsupported container)</w:t>
+            </w:r>
+          </w:p>
+        </w:tc>
+      </w:tr>
+      <w:tr>
+        <w:trPr>
+          <w:cantSplit/>
+        </w:trPr>
+        <w:tc>
+          <w:tcPr>
+            <w:tcW w:type="dxa" w:w="2232"/>
+            <w:shd w:fill="EEF3F8"/>
+            <w:vAlign w:val="center"/>
+            <w:tcMar>
+              <w:top w:w="85" w:type="dxa"/>
+              <w:start w:w="110" w:type="dxa"/>
+              <w:bottom w:w="85" w:type="dxa"/>
+              <w:end w:w="110" w:type="dxa"/>
+            </w:tcMar>
+          </w:tcPr>
+          <w:p>
+            <w:pPr>
+              <w:spacing w:after="0" w:line="252" w:lineRule="auto"/>
+              <w:jc w:val="left"/>
+            </w:pPr>
+            <w:r>
+              <w:rPr>
+                <w:rFonts w:ascii="Arial" w:hAnsi="Arial" w:eastAsia="Arial"/>
+                <w:b w:val="0"/>
+                <w:color w:val="000000"/>
+                <w:sz w:val="16"/>
+              </w:rPr>
+              <w:t xml:space="preserve">Non-final file with a SHA-256 mismatch, size-limit excess or path outside the root</w:t>
+            </w:r>
+          </w:p>
+        </w:tc>
+        <w:tc>
+          <w:tcPr>
+            <w:tcW w:type="dxa" w:w="3528"/>
+            <w:shd w:fill="EEF3F8"/>
+            <w:vAlign w:val="center"/>
+            <w:tcMar>
+              <w:top w:w="85" w:type="dxa"/>
+              <w:start w:w="110" w:type="dxa"/>
+              <w:bottom w:w="85" w:type="dxa"/>
+              <w:end w:w="110" w:type="dxa"/>
+            </w:tcMar>
+          </w:tcPr>
+          <w:p>
+            <w:pPr>
+              <w:spacing w:after="0" w:line="252" w:lineRule="auto"/>
+              <w:jc w:val="left"/>
+            </w:pPr>
+            <w:r>
+              <w:rPr>
+                <w:rFonts w:ascii="Arial" w:hAnsi="Arial" w:eastAsia="Arial"/>
+                <w:b w:val="0"/>
+                <w:color w:val="000000"/>
+                <w:sz w:val="16"/>
+              </w:rPr>
+              <w:t xml:space="preserve">Do not bind the file; skip only checks that need it; workflow rules that rely on it are not_assessed.</w:t>
+            </w:r>
+          </w:p>
+        </w:tc>
+        <w:tc>
+          <w:tcPr>
+            <w:tcW w:type="dxa" w:w="4464"/>
+            <w:shd w:fill="EEF3F8"/>
+            <w:vAlign w:val="center"/>
+            <w:tcMar>
+              <w:top w:w="85" w:type="dxa"/>
+              <w:start w:w="110" w:type="dxa"/>
+              <w:bottom w:w="85" w:type="dxa"/>
+              <w:end w:w="110" w:type="dxa"/>
+            </w:tcMar>
+          </w:tcPr>
+          <w:p>
+            <w:pPr>
+              <w:spacing w:after="0" w:line="252" w:lineRule="auto"/>
+              <w:jc w:val="left"/>
+            </w:pPr>
+            <w:r>
+              <w:rPr>
+                <w:rFonts w:ascii="Arial" w:hAnsi="Arial" w:eastAsia="Arial"/>
+                <w:b w:val="0"/>
+                <w:color w:val="000000"/>
+                <w:sz w:val="16"/>
+              </w:rPr>
+              <w:t xml:space="preserve">OBJECT_HASH_MISMATCH, OBJECT_SKIPPED_SIZE_LIMIT or OBJECT_PATH_INVALID</w:t>
+            </w:r>
+          </w:p>
+        </w:tc>
+      </w:tr>
+      <w:tr>
+        <w:trPr>
+          <w:cantSplit/>
+        </w:trPr>
+        <w:tc>
+          <w:tcPr>
+            <w:tcW w:type="dxa" w:w="2232"/>
+            <w:shd w:fill="EEF3F8"/>
+            <w:vAlign w:val="center"/>
+            <w:tcMar>
+              <w:top w:w="85" w:type="dxa"/>
+              <w:start w:w="110" w:type="dxa"/>
+              <w:bottom w:w="85" w:type="dxa"/>
+              <w:end w:w="110" w:type="dxa"/>
+            </w:tcMar>
+          </w:tcPr>
+          <w:p>
+            <w:pPr>
+              <w:spacing w:after="0" w:line="252" w:lineRule="auto"/>
+              <w:jc w:val="left"/>
+            </w:pPr>
+            <w:r>
+              <w:rPr>
+                <w:rFonts w:ascii="Arial" w:hAnsi="Arial" w:eastAsia="Arial"/>
+                <w:b w:val="0"/>
+                <w:color w:val="000000"/>
+                <w:sz w:val="16"/>
+              </w:rPr>
+              <w:t xml:space="preserve">Non-final upper-case hash or suffix, or file name not matching the hash</w:t>
+            </w:r>
+          </w:p>
+        </w:tc>
+        <w:tc>
+          <w:tcPr>
+            <w:tcW w:type="dxa" w:w="3528"/>
+            <w:shd w:fill="EEF3F8"/>
+            <w:vAlign w:val="center"/>
+            <w:tcMar>
+              <w:top w:w="85" w:type="dxa"/>
+              <w:start w:w="110" w:type="dxa"/>
+              <w:bottom w:w="85" w:type="dxa"/>
+              <w:end w:w="110" w:type="dxa"/>
+            </w:tcMar>
+          </w:tcPr>
+          <w:p>
+            <w:pPr>
+              <w:spacing w:after="0" w:line="252" w:lineRule="auto"/>
+              <w:jc w:val="left"/>
+            </w:pPr>
+            <w:r>
+              <w:rPr>
+                <w:rFonts w:ascii="Arial" w:hAnsi="Arial" w:eastAsia="Arial"/>
+                <w:b w:val="0"/>
+                <w:color w:val="000000"/>
+                <w:sz w:val="16"/>
+              </w:rPr>
+              <w:t xml:space="preserve">Do not correct it; do not bind the file; skip only checks that need it.</w:t>
+            </w:r>
+          </w:p>
+        </w:tc>
+        <w:tc>
+          <w:tcPr>
+            <w:tcW w:type="dxa" w:w="4464"/>
+            <w:shd w:fill="EEF3F8"/>
+            <w:vAlign w:val="center"/>
+            <w:tcMar>
+              <w:top w:w="85" w:type="dxa"/>
+              <w:start w:w="110" w:type="dxa"/>
+              <w:bottom w:w="85" w:type="dxa"/>
+              <w:end w:w="110" w:type="dxa"/>
+            </w:tcMar>
+          </w:tcPr>
+          <w:p>
+            <w:pPr>
+              <w:spacing w:after="0" w:line="252" w:lineRule="auto"/>
+              <w:jc w:val="left"/>
+            </w:pPr>
+            <w:r>
+              <w:rPr>
+                <w:rFonts w:ascii="Arial" w:hAnsi="Arial" w:eastAsia="Arial"/>
+                <w:b w:val="0"/>
+                <w:color w:val="000000"/>
+                <w:sz w:val="16"/>
+              </w:rPr>
+              <w:t xml:space="preserve">INVALID_HASH_FORMAT or INVALID_OBJECT_PATH</w:t>
+            </w:r>
+          </w:p>
+        </w:tc>
+      </w:tr>
+      <w:tr>
+        <w:trPr>
+          <w:cantSplit/>
+        </w:trPr>
+        <w:tc>
+          <w:tcPr>
+            <w:tcW w:type="dxa" w:w="2232"/>
+            <w:shd w:fill="EEF3F8"/>
+            <w:vAlign w:val="center"/>
+            <w:tcMar>
+              <w:top w:w="85" w:type="dxa"/>
+              <w:start w:w="110" w:type="dxa"/>
+              <w:bottom w:w="85" w:type="dxa"/>
+              <w:end w:w="110" w:type="dxa"/>
+            </w:tcMar>
+          </w:tcPr>
+          <w:p>
+            <w:pPr>
+              <w:spacing w:after="0" w:line="252" w:lineRule="auto"/>
+              <w:jc w:val="left"/>
+            </w:pPr>
+            <w:r>
+              <w:rPr>
+                <w:rFonts w:ascii="Arial" w:hAnsi="Arial" w:eastAsia="Arial"/>
+                <w:b w:val="0"/>
+                <w:color w:val="000000"/>
+                <w:sz w:val="16"/>
+              </w:rPr>
+              <w:t xml:space="preserve">Unknown or misspelled attribute field</w:t>
+            </w:r>
+          </w:p>
+        </w:tc>
+        <w:tc>
+          <w:tcPr>
+            <w:tcW w:type="dxa" w:w="3528"/>
+            <w:shd w:fill="EEF3F8"/>
+            <w:vAlign w:val="center"/>
+            <w:tcMar>
+              <w:top w:w="85" w:type="dxa"/>
+              <w:start w:w="110" w:type="dxa"/>
+              <w:bottom w:w="85" w:type="dxa"/>
+              <w:end w:w="110" w:type="dxa"/>
+            </w:tcMar>
+          </w:tcPr>
+          <w:p>
+            <w:pPr>
+              <w:spacing w:after="0" w:line="252" w:lineRule="auto"/>
+              <w:jc w:val="left"/>
+            </w:pPr>
+            <w:r>
+              <w:rPr>
+                <w:rFonts w:ascii="Arial" w:hAnsi="Arial" w:eastAsia="Arial"/>
+                <w:b w:val="0"/>
+                <w:color w:val="000000"/>
+                <w:sz w:val="16"/>
+              </w:rPr>
+              <w:t xml:space="preserve">Do not correct it; skip the checks that use that declaration (a misspelled relationship field disables that relationship's content checks).</w:t>
+            </w:r>
+          </w:p>
+        </w:tc>
+        <w:tc>
+          <w:tcPr>
+            <w:tcW w:type="dxa" w:w="4464"/>
+            <w:shd w:fill="EEF3F8"/>
+            <w:vAlign w:val="center"/>
+            <w:tcMar>
+              <w:top w:w="85" w:type="dxa"/>
+              <w:start w:w="110" w:type="dxa"/>
+              <w:bottom w:w="85" w:type="dxa"/>
+              <w:end w:w="110" w:type="dxa"/>
+            </w:tcMar>
+          </w:tcPr>
+          <w:p>
+            <w:pPr>
+              <w:spacing w:after="0" w:line="252" w:lineRule="auto"/>
+              <w:jc w:val="left"/>
+            </w:pPr>
+            <w:r>
+              <w:rPr>
+                <w:rFonts w:ascii="Arial" w:hAnsi="Arial" w:eastAsia="Arial"/>
+                <w:b w:val="0"/>
+                <w:color w:val="000000"/>
+                <w:sz w:val="16"/>
+              </w:rPr>
+              <w:t xml:space="preserve">UNKNOWN_FIELD with location and suggested spelling</w:t>
+            </w:r>
+          </w:p>
+        </w:tc>
+      </w:tr>
+      <w:tr>
+        <w:trPr>
+          <w:cantSplit/>
+        </w:trPr>
+        <w:tc>
+          <w:tcPr>
+            <w:tcW w:type="dxa" w:w="2232"/>
+            <w:shd w:fill="EEF3F8"/>
+            <w:vAlign w:val="center"/>
+            <w:tcMar>
+              <w:top w:w="85" w:type="dxa"/>
+              <w:start w:w="110" w:type="dxa"/>
+              <w:bottom w:w="85" w:type="dxa"/>
+              <w:end w:w="110" w:type="dxa"/>
+            </w:tcMar>
+          </w:tcPr>
+          <w:p>
+            <w:pPr>
+              <w:spacing w:after="0" w:line="252" w:lineRule="auto"/>
+              <w:jc w:val="left"/>
+            </w:pPr>
+            <w:r>
+              <w:rPr>
+                <w:rFonts w:ascii="Arial" w:hAnsi="Arial" w:eastAsia="Arial"/>
+                <w:b w:val="0"/>
+                <w:color w:val="000000"/>
+                <w:sz w:val="16"/>
+              </w:rPr>
               <w:t>Unknown final artefact type</w:t>
             </w:r>
           </w:p>
@@ -2237,7 +2593,7 @@
           <w:color w:val="000000"/>
           <w:sz w:val="21"/>
         </w:rPr>
-        <w:t>When any artefact or relationship is skipped, every otherwise available axis is downgraded to partial. The value remains the result for the retained evidence only. The coverage object states the submitted, evaluated, and skipped counts, so omitted evidence cannot appear to be a complete assessment.</w:t>
+        <w:t xml:space="preserve">When any artefact or relationship is skipped, or an input error makes checks unavailable (finding SCORE_AFFECTED_BY_INPUT_ERRORS), every otherwise available axis is downgraded to partial. The value remains the result for the retained evidence only. The coverage object states the submitted, evaluated, and skipped counts, so omitted evidence cannot appear to be a complete assessment.</w:t>
       </w:r>
     </w:p>
     <w:p>
@@ -2269,6 +2625,20 @@
           <w:sz w:val="20"/>
         </w:rPr>
         <w:t>The program does not select an artefact type from a filename, extension, parser result, or media content.</w:t>
+      </w:r>
+    </w:p>
+    <w:p>
+      <w:pPr>
+        <w:pStyle w:val="ListBullet"/>
+        <w:spacing w:after="60" w:line="264" w:lineRule="auto"/>
+      </w:pPr>
+      <w:r>
+        <w:rPr>
+          <w:rFonts w:ascii="Arial" w:hAnsi="Arial" w:eastAsia="Arial"/>
+          <w:color w:val="000000"/>
+          <w:sz w:val="20"/>
+        </w:rPr>
+        <w:t xml:space="preserve">The program does not correct malformed input such as upper-case hashes or suffixes or misspelled fields; it reports each problem with its location and a suggested fix.</w:t>
       </w:r>
     </w:p>
     <w:p>
@@ -2761,7 +3131,7 @@
           </w:tcPr>
           <w:p>
             <w:r>
-              <w:t>File and request limits, chunked packed-PCM decoding, a 256 MiB request cache budget, declared-range seeking, bounded exploratory downsampling, search and source-count caps, and constrained DTW keep analysis predictable; every parser treats input as untrusted.</w:t>
+              <w:t xml:space="preserve">File and request limits, streamed WAV inspection and block decoding, a 128 MiB active PCM-window limit, a 256 MiB proxy-cache limit, a weighted work budget, declared-range seeking, complete-file anti-aliased low-rate proxies, search and source-count caps, constrained DTW, and the caller's wall-clock timeout keep analysis predictable; every parser treats input as untrusted.</w:t>
             </w:r>
           </w:p>
         </w:tc>
@@ -7103,7 +7473,7 @@
         <w:spacing w:after="120" w:line="274" w:lineRule="auto"/>
       </w:pPr>
       <w:r>
-        <w:t>The objects map binds a declared SHA-256 digest to a bundle-relative path. A permitted suffix does not determine the artefact type. The evaluator resolves the path inside the supplied root, checks file size, calculates the digest once, binds the verified file directly, and then dispatches a parser from the submitter's type.</w:t>
+        <w:t xml:space="preserve">The objects map binds a declared SHA-256 digest to a bundle-relative path. A suffix does not determine the artefact type or the audio format: the file content does, so AIFF, FLAC, Ogg or MP3 data in a .wav file is reported as that format and is unsupported. Hashes and suffixes must be lower case; they are never corrected. The evaluator checks the final object first, resolves each path inside the supplied root, checks file size, calculates the digest once, binds the verified file directly, and then dispatches a parser from the submitter's type.</w:t>
       </w:r>
     </w:p>
     <w:tbl>
@@ -7342,7 +7712,7 @@
           </w:tcPr>
           <w:p>
             <w:r>
-              <w:t>RIFF bounds, integer PCM including the extensible PCM SubFormat, channels, rate, bit depth, data length, and declared technical fields. A non-final parser failure is isolated; the final remains strict.</w:t>
+              <w:t xml:space="preserve">Streaming RIFF/WAVE inspection; integer PCM (8/16/24/32-bit) and IEEE float (32/64-bit), including matching WAVE_FORMAT_EXTENSIBLE SubFormats; channels, rate, bit depth, data length, and declared technical fields. Trailing bytes and unfinalised sizes are warnings; RF64/BW64 and compressed codecs are unsupported. A non-final parser failure is isolated; the final remains strict.</w:t>
             </w:r>
           </w:p>
         </w:tc>
@@ -8386,7 +8756,7 @@
         <w:spacing w:after="120" w:line="274" w:lineRule="auto"/>
       </w:pPr>
       <w:r>
-        <w:t>Resource limits are 32 MiB per file and 128 MiB in total for one evaluation. Decoded PCM windows use a separate 256 MiB request-level cache budget. Exact declared ranges are read directly in chunks, while exploratory searches retain a 60-second bound. The final artefact must have a present, hash-matched file. Missing non-final mappings are reported as findings, while traversal outside the bundle root and SHA-256 mismatches are errors.</w:t>
+        <w:t xml:space="preserve">Resource limits are 512 MiB per file and 1 GiB in total for one evaluation. WAV headers and chunks are inspected incrementally rather than read whole. Decoded PCM is limited to 128 MiB of active windows and 256 MiB of cached low-rate proxies per request, and audio work is bounded by a weighted channel-second budget. Exact declared ranges are streamed at the original sample rate in blocks of about ten seconds, and exploratory searches use complete-file proxies, so no part of a file is skipped because of its duration. The wall-clock timeout is the caller's options.timeout_seconds, including worker startup; the evaluator adds no ceiling of its own and uses 60 seconds only when a request carries no valid value. Audio checks stop starting new work shortly before the caller's deadline and return resource_budget_exhausted, so a slow request still returns its other results. The final artefact is checked first and must be a present, hash-matched file inside the bundle root within the size limits; otherwise the request stops. Non-final objects that are missing, outside the root, over the size limits, hash-mismatched or written with an upper-case hash or suffix are isolated and reported, and only the checks that need them become unavailable. If a non-final object changes while it is being evaluated, the request is evaluated once more with that object isolated from the start, so no result read from a half-replaced file survives; a second change, or any change to the final artefact, stops the request with error.</w:t>
       </w:r>
     </w:p>
     <w:p>
@@ -8412,7 +8782,7 @@
         <w:spacing w:after="120" w:line="274" w:lineRule="auto"/>
       </w:pPr>
       <w:r>
-        <w:t>The current program combines registered libevchain passes with graph-level assessment classes. The Pipeline executes WavMetadataPass once for each audio artefact and RelationshipIntegrityPass once for each retained relationship. BoundFileIntegrityPass and the integrity-axis assembler consume those cached checks instead of repeating the technical or edge comparisons. A non-final WAV parser failure is recorded as WAV_PARSER_FAILED and causes dependent physical-audio checks to skip that node. The engine then runs other parsers, exact declared derivation checks, and eight bounded physical-audio diagnostics to produce axis values, checks, findings, and reasoning. Exact Edit, Comp, Stem, and Mix checks retain block locations and report a contradiction when consecutive non-silent blocks exceed the local residual threshold for at least 0.20 seconds. Signal-estimated offsets, gains, and channel matrices remain diagnostic only and do not rewrite graph claims, create relationships, or become exact provenance proof.</w:t>
+        <w:t xml:space="preserve">The current program combines registered libevchain passes with graph-level assessment classes. The Pipeline executes WavMetadataPass once for each audio artefact and RelationshipIntegrityPass once for each retained relationship. BoundFileIntegrityPass and the integrity-axis assembler consume those cached checks instead of repeating the technical or edge comparisons. A non-final WAV parser failure is recorded as WAV_PARSER_FAILED and causes dependent physical-audio checks to skip that node. Non-finite IEEE-float samples found during decoding produce WAV_SAMPLE_DATA_INVALID and make only checks that depend on that node unavailable. The engine then runs other parsers, exact declared derivation checks, and eight bounded physical-audio diagnostics to produce axis values, checks, findings, and reasoning. Exact Edit, Comp, Stem, and Mix checks retain block locations and report a contradiction when consecutive non-silent blocks exceed the local residual threshold for at least 0.20 seconds. Signal-estimated offsets, gains, and channel matrices remain diagnostic only and do not rewrite graph claims, create relationships, or become exact provenance proof.</w:t>
       </w:r>
     </w:p>
     <w:p>
@@ -8641,7 +9011,7 @@
           </w:tcPr>
           <w:p>
             <w:r>
-              <w:t>Strict integer PCM structure, extensible PCM SubFormat, WAV metadata, and standardised technical checks; non-final failures become parser_failed.</w:t>
+              <w:t xml:space="preserve">Streaming RIFF/WAVE structure for integer PCM and IEEE float, including EXTENSIBLE SubFormats; RIFF warnings; WAV metadata; and standardised technical checks; non-final failures become parser_failed.</w:t>
             </w:r>
           </w:p>
         </w:tc>
@@ -8668,7 +9038,7 @@
                 <w:color w:val="000000"/>
                 <w:sz w:val="16"/>
               </w:rPr>
-              <w:t>Observation, checks, and reasoning; cached per artefact.</w:t>
+              <w:t xml:space="preserve">Observation, checks, and reasoning; cached per artefact together with the WAV descriptor reused by content checks.</w:t>
             </w:r>
           </w:p>
         </w:tc>
@@ -9487,7 +9857,7 @@
                 <w:color w:val="000000"/>
                 <w:sz w:val="16"/>
               </w:rPr>
-              <w:t>Bounded short-time energy and shape landmarks plus waveform correlation estimate source and target offsets.</w:t>
+              <w:t xml:space="preserve">FFT-normalised cross-correlation over the complete low-rate proxy proposes candidates; short-time energy and shape landmarks plus waveform correlation then estimate source and target offsets.</w:t>
             </w:r>
           </w:p>
         </w:tc>
@@ -9966,7 +10336,7 @@
                 <w:color w:val="000000"/>
                 <w:sz w:val="16"/>
               </w:rPr>
-              <w:t>stem_mix_residual; fitted matrix parameters are diagnostic only.</w:t>
+              <w:t xml:space="preserve">stem_mix_residual; fitted matrix parameters are diagnostic only; IEEE-float targets report peak amplitude instead of a clipping fraction.</w:t>
             </w:r>
           </w:p>
         </w:tc>
@@ -10165,7 +10535,7 @@
                 <w:color w:val="000000"/>
                 <w:sz w:val="16"/>
               </w:rPr>
-              <w:t>Bounded landmark search, waveform correlation, ambiguity comparison, and DTW locate a submitted sample in its declared source.</w:t>
+              <w:t xml:space="preserve">Complete-proxy FFT candidate search, landmarks, waveform correlation, ambiguity comparison, and DTW locate a submitted sample in its declared source.</w:t>
             </w:r>
           </w:p>
         </w:tc>
@@ -10911,7 +11281,7 @@
         <w:spacing w:after="120" w:line="274" w:lineRule="auto"/>
       </w:pPr>
       <w:r>
-        <w:t>Artefact and Evidence objects cache results by Pass class. WavMetadataPass emits measured WAV data and standardised technical checks once per audio artefact. RelationshipIntegrityPass requests those cached results for its source and target, so it does not parse either WAV again. BoundFileIntegrityPass later reuses the same technical checks when it assembles the file-integrity layer. Verified object hashes are reused during binding, source_revision is cached once per process, and decoded PCM is cached per request by artefact and time window. Each Artefact or Evidence object also maintains a Pass call stack. If a Pass requests itself directly or through another Pass, the library raises CircularEvaluationException.</w:t>
+        <w:t xml:space="preserve">Artefact and Evidence objects cache results by Pass class. WavMetadataPass emits measured WAV data and standardised technical checks once per audio artefact. RelationshipIntegrityPass requests those cached results for its source and target, so it does not parse either WAV again. BoundFileIntegrityPass later reuses the same technical checks when it assembles the file-integrity layer. Verified object hashes are reused during binding, source_revision is cached once per process, decoded PCM windows of up to 16 MiB are cached per request by artefact and time window, each artefact's WAV descriptor is cached after inspection, and one complete-file low-rate proxy per artefact is cached within a 256 MiB request budget. Each Artefact or Evidence object also maintains a Pass call stack. If a Pass requests itself directly or through another Pass, the library raises CircularEvaluationException.</w:t>
       </w:r>
     </w:p>
     <w:p>
@@ -13841,7 +14211,7 @@
                 <w:color w:val="000000"/>
                 <w:sz w:val="16"/>
               </w:rPr>
-              <w:t>Code, severity, message, and evidence data</w:t>
+              <w:t xml:space="preserve">Code, severity, message, and evidence data; input errors add location, suggested fix and affected checks</w:t>
             </w:r>
           </w:p>
         </w:tc>
@@ -14150,7 +14520,7 @@
                 <w:color w:val="000000"/>
                 <w:sz w:val="17"/>
               </w:rPr>
-              <w:t>Main entry point, isolated worker, response assembly, partial-axis downgrade, and output.</w:t>
+              <w:t xml:space="preserve">Main entry point, isolated worker with the caller-requested wall-clock timeout and an earlier audio deadline, response assembly, one re-evaluation when a non-final file changes, input-error summary, partial-axis downgrade, and output.</w:t>
             </w:r>
           </w:p>
         </w:tc>
@@ -14331,7 +14701,7 @@
                 <w:color w:val="000000"/>
                 <w:sz w:val="17"/>
               </w:rPr>
-              <w:t>Required packages including jsonschema, pypdf, and xmlschema.</w:t>
+              <w:t xml:space="preserve">Pinned required packages including jsonschema, numpy, pypdf, and xmlschema.</w:t>
             </w:r>
           </w:p>
         </w:tc>
@@ -14664,7 +15034,7 @@
           </w:tcPr>
           <w:p>
             <w:r>
-              <w:t>Reads and validates requests, adapts CSEC input, quarantines local semantic errors, records coverage and unknown inputs, caches source_revision, and builds response identity.</w:t>
+              <w:t xml:space="preserve">Reads and validates requests, adapts CSEC input, screens hash, object-path and unknown-field errors without correcting them (with spelling suggestions), stops on a final-artefact format error, quarantines local semantic errors, records coverage and unknown inputs, caches source_revision, and builds response identity.</w:t>
             </w:r>
           </w:p>
         </w:tc>
@@ -14774,7 +15144,7 @@
           </w:tcPr>
           <w:p>
             <w:r>
-              <w:t>Hashes and binds files once, validates integer PCM and WAVE_FORMAT_EXTENSIBLE, isolates non-final WAV parser failures, runs WavMetadataPass and the relationship EvidencePass, and orchestrates assessments.</w:t>
+              <w:t xml:space="preserve">Checks the final object first, hashes and binds files once, isolates non-final object problems, inspects WAV structure through wav_io (integer PCM and IEEE float, including WAVE_FORMAT_EXTENSIBLE), isolates non-final WAV parser failures, runs WavMetadataPass and the relationship EvidencePass, and orchestrates assessments.</w:t>
             </w:r>
           </w:p>
         </w:tc>
@@ -14874,7 +15244,7 @@
           </w:tcPr>
           <w:p>
             <w:r>
-              <w:t>Exact declared Edit, Comp, Stem, and Mix reconstruction with timed local-mismatch regions, declared-range PCM seeking, packed request-scoped PCM caching, and conservative Master continuity using complete-file durations.</w:t>
+              <w:t xml:space="preserve">Exact declared Edit, Comp, Stem, and Mix reconstruction with timed local-mismatch regions, original-rate PCM streamed through wav_io in blocks of about ten seconds, complete-file low-rate analysis proxies with request-scoped caching, and conservative Master continuity using complete-file durations.</w:t>
             </w:r>
           </w:p>
         </w:tc>
@@ -14994,7 +15364,7 @@
                 <w:color w:val="000000"/>
                 <w:sz w:val="16"/>
               </w:rPr>
-              <w:t>Loads policy safely, evaluates triggers, and reports workflow completeness.</w:t>
+              <w:t xml:space="preserve">Loads policy safely, evaluates triggers, and reports workflow completeness; artefacts isolated by input errors count as not assessed rather than missing.</w:t>
             </w:r>
           </w:p>
         </w:tc>
@@ -15055,7 +15425,68 @@
                 <w:color w:val="000000"/>
                 <w:sz w:val="16"/>
               </w:rPr>
-              <w:t>Extracts WAV chunks and metadata used by WavMetadataPass.</w:t>
+              <w:t xml:space="preserve">Extracts embedded WAV metadata (LIST/INFO, bext, cue, smpl, fact, ID3) chunk by chunk through wav_io, reading at most 1 MiB per metadata chunk.</w:t>
+            </w:r>
+          </w:p>
+        </w:tc>
+      </w:tr>
+      <w:tr>
+        <w:trPr>
+          <w:cantSplit/>
+        </w:trPr>
+        <w:tc>
+          <w:tcPr>
+            <w:tcW w:type="dxa" w:w="3240"/>
+            <w:shd w:fill="EEF3F8"/>
+            <w:vAlign w:val="center"/>
+            <w:tcMar>
+              <w:top w:w="85" w:type="dxa"/>
+              <w:start w:w="110" w:type="dxa"/>
+              <w:bottom w:w="85" w:type="dxa"/>
+              <w:end w:w="110" w:type="dxa"/>
+            </w:tcMar>
+          </w:tcPr>
+          <w:p>
+            <w:pPr>
+              <w:spacing w:after="0" w:line="252" w:lineRule="auto"/>
+              <w:jc w:val="left"/>
+            </w:pPr>
+            <w:r>
+              <w:rPr>
+                <w:rFonts w:ascii="Arial" w:hAnsi="Arial" w:eastAsia="Arial"/>
+                <w:b/>
+                <w:color w:val="000000"/>
+                <w:sz w:val="16"/>
+              </w:rPr>
+              <w:t>music_target/wav_io.py</w:t>
+            </w:r>
+          </w:p>
+        </w:tc>
+        <w:tc>
+          <w:tcPr>
+            <w:tcW w:type="dxa" w:w="6984"/>
+            <w:shd w:fill="EEF3F8"/>
+            <w:vAlign w:val="center"/>
+            <w:tcMar>
+              <w:top w:w="85" w:type="dxa"/>
+              <w:start w:w="110" w:type="dxa"/>
+              <w:bottom w:w="85" w:type="dxa"/>
+              <w:end w:w="110" w:type="dxa"/>
+            </w:tcMar>
+          </w:tcPr>
+          <w:p>
+            <w:pPr>
+              <w:spacing w:after="0" w:line="252" w:lineRule="auto"/>
+              <w:jc w:val="left"/>
+            </w:pPr>
+            <w:r>
+              <w:rPr>
+                <w:rFonts w:ascii="Arial" w:hAnsi="Arial" w:eastAsia="Arial"/>
+                <w:b w:val="0"/>
+                <w:color w:val="000000"/>
+                <w:sz w:val="16"/>
+              </w:rPr>
+              <w:t xml:space="preserve">Streaming RIFF/WAVE inspection with chunk-safety checks and stable warnings, and vectorised decoding of integer PCM and IEEE float, including EXTENSIBLE, into float32 NumPy arrays.</w:t>
             </w:r>
           </w:p>
         </w:tc>
@@ -17674,7 +18105,7 @@
           </w:tcPr>
           <w:p>
             <w:r>
-              <w:t>77 unit and end-to-end tests, including quarantine, non-final WAV isolation, extensible PCM, graph safety, workflows, MIDI, sheets, DDEX, final-scoped and standalone C2PA, hash caching, local tampering, declared ranges beyond 60 seconds, full Master duration, and packed PCM caching.</w:t>
+              <w:t xml:space="preserve">126 unit and end-to-end tests, including input isolation and final-first stopping, re-evaluation when a non-final file changes during evaluation, unknown-field suggestions, audio container detection by content, byte-capped decoding, deadline degradation, quarantine, non-final WAV isolation, integer and float EXTENSIBLE WAV, float32/64 decoding, non-finite sample rejection, RIFF warnings, graph safety, workflows, MIDI, sheets, DDEX, final-scoped and standalone C2PA, hash caching, local tampering, declared ranges beyond 60 seconds, full Master duration, full-file proxy caching, and requested-timeout handling.</w:t>
             </w:r>
           </w:p>
         </w:tc>
@@ -17965,7 +18396,7 @@
           </w:tcPr>
           <w:p>
             <w:r>
-              <w:t>Current version 0.5.0 verification snapshot with 77 passing tests and remaining calibration gaps.</w:t>
+              <w:t xml:space="preserve">Current version 0.5.0 verification snapshot with 126 passing tests and remaining calibration gaps.</w:t>
             </w:r>
           </w:p>
         </w:tc>
@@ -18297,7 +18728,7 @@
                 <w:color w:val="000000"/>
                 <w:sz w:val="16"/>
               </w:rPr>
-              <w:t>docs/01_*.md Chinese source file</w:t>
+              <w:t>docs/03_CSEC_HANDOFF.md</w:t>
             </w:r>
           </w:p>
         </w:tc>
@@ -18325,7 +18756,7 @@
                 <w:color w:val="000000"/>
                 <w:sz w:val="16"/>
               </w:rPr>
-              <w:t>Early source review and team responsibility boundaries.</w:t>
+              <w:t>CSEC execution, exchange format, quarantine, and support boundaries.</w:t>
             </w:r>
           </w:p>
         </w:tc>
@@ -18357,7 +18788,7 @@
                 <w:color w:val="000000"/>
                 <w:sz w:val="16"/>
               </w:rPr>
-              <w:t>docs/02_*.md Chinese source file</w:t>
+              <w:t>docs/NEXT_TASKS.md</w:t>
             </w:r>
           </w:p>
         </w:tc>
@@ -18384,7 +18815,7 @@
                 <w:color w:val="000000"/>
                 <w:sz w:val="16"/>
               </w:rPr>
-              <w:t>Implementation history.</w:t>
+              <w:t>Prioritised calibration, real-fixture, false-positive, caching, CLI, CI, and broader media work after version 0.5.0.</w:t>
             </w:r>
           </w:p>
         </w:tc>
@@ -18396,7 +18827,6 @@
         <w:tc>
           <w:tcPr>
             <w:tcW w:type="dxa" w:w="3528"/>
-            <w:shd w:fill="EEF3F8"/>
             <w:vAlign w:val="center"/>
             <w:tcMar>
               <w:top w:w="85" w:type="dxa"/>
@@ -18417,14 +18847,13 @@
                 <w:color w:val="000000"/>
                 <w:sz w:val="16"/>
               </w:rPr>
-              <w:t>docs/03_CSEC_HANDOFF.md</w:t>
+              <w:t>docs/SHEET_FORMATS.md</w:t>
             </w:r>
           </w:p>
         </w:tc>
         <w:tc>
           <w:tcPr>
             <w:tcW w:type="dxa" w:w="6696"/>
-            <w:shd w:fill="EEF3F8"/>
             <w:vAlign w:val="center"/>
             <w:tcMar>
               <w:top w:w="85" w:type="dxa"/>
@@ -18445,247 +18874,7 @@
                 <w:color w:val="000000"/>
                 <w:sz w:val="16"/>
               </w:rPr>
-              <w:t>CSEC execution, exchange format, quarantine, and support boundaries.</w:t>
-            </w:r>
-          </w:p>
-        </w:tc>
-      </w:tr>
-      <w:tr>
-        <w:trPr>
-          <w:cantSplit/>
-        </w:trPr>
-        <w:tc>
-          <w:tcPr>
-            <w:tcW w:type="dxa" w:w="3528"/>
-            <w:vAlign w:val="center"/>
-            <w:tcMar>
-              <w:top w:w="85" w:type="dxa"/>
-              <w:start w:w="110" w:type="dxa"/>
-              <w:bottom w:w="85" w:type="dxa"/>
-              <w:end w:w="110" w:type="dxa"/>
-            </w:tcMar>
-          </w:tcPr>
-          <w:p>
-            <w:pPr>
-              <w:spacing w:after="0" w:line="252" w:lineRule="auto"/>
-              <w:jc w:val="left"/>
-            </w:pPr>
-            <w:r>
-              <w:rPr>
-                <w:rFonts w:ascii="Arial" w:hAnsi="Arial" w:eastAsia="Arial"/>
-                <w:b/>
-                <w:color w:val="000000"/>
-                <w:sz w:val="16"/>
-              </w:rPr>
-              <w:t>docs/NEXT_TASKS.md</w:t>
-            </w:r>
-          </w:p>
-        </w:tc>
-        <w:tc>
-          <w:tcPr>
-            <w:tcW w:type="dxa" w:w="6696"/>
-            <w:vAlign w:val="center"/>
-            <w:tcMar>
-              <w:top w:w="85" w:type="dxa"/>
-              <w:start w:w="110" w:type="dxa"/>
-              <w:bottom w:w="85" w:type="dxa"/>
-              <w:end w:w="110" w:type="dxa"/>
-            </w:tcMar>
-          </w:tcPr>
-          <w:p>
-            <w:pPr>
-              <w:spacing w:after="0" w:line="252" w:lineRule="auto"/>
-              <w:jc w:val="left"/>
-            </w:pPr>
-            <w:r>
-              <w:rPr>
-                <w:rFonts w:ascii="Arial" w:hAnsi="Arial" w:eastAsia="Arial"/>
-                <w:b w:val="0"/>
-                <w:color w:val="000000"/>
-                <w:sz w:val="16"/>
-              </w:rPr>
-              <w:t>Prioritised calibration, real-fixture, false-positive, caching, CLI, CI, and broader media work after version 0.5.0.</w:t>
-            </w:r>
-          </w:p>
-        </w:tc>
-      </w:tr>
-      <w:tr>
-        <w:trPr>
-          <w:cantSplit/>
-        </w:trPr>
-        <w:tc>
-          <w:tcPr>
-            <w:tcW w:type="dxa" w:w="3528"/>
-            <w:shd w:fill="EEF3F8"/>
-            <w:vAlign w:val="center"/>
-            <w:tcMar>
-              <w:top w:w="85" w:type="dxa"/>
-              <w:start w:w="110" w:type="dxa"/>
-              <w:bottom w:w="85" w:type="dxa"/>
-              <w:end w:w="110" w:type="dxa"/>
-            </w:tcMar>
-          </w:tcPr>
-          <w:p>
-            <w:pPr>
-              <w:spacing w:after="0" w:line="252" w:lineRule="auto"/>
-              <w:jc w:val="left"/>
-            </w:pPr>
-            <w:r>
-              <w:rPr>
-                <w:rFonts w:ascii="Arial" w:hAnsi="Arial" w:eastAsia="Arial"/>
-                <w:b/>
-                <w:color w:val="000000"/>
-                <w:sz w:val="16"/>
-              </w:rPr>
-              <w:t>docs/PROGRAM_STRUCTURE.md</w:t>
-            </w:r>
-          </w:p>
-        </w:tc>
-        <w:tc>
-          <w:tcPr>
-            <w:tcW w:type="dxa" w:w="6696"/>
-            <w:shd w:fill="EEF3F8"/>
-            <w:vAlign w:val="center"/>
-            <w:tcMar>
-              <w:top w:w="85" w:type="dxa"/>
-              <w:start w:w="110" w:type="dxa"/>
-              <w:bottom w:w="85" w:type="dxa"/>
-              <w:end w:w="110" w:type="dxa"/>
-            </w:tcMar>
-          </w:tcPr>
-          <w:p>
-            <w:pPr>
-              <w:spacing w:after="0" w:line="252" w:lineRule="auto"/>
-              <w:jc w:val="left"/>
-            </w:pPr>
-            <w:r>
-              <w:rPr>
-                <w:rFonts w:ascii="Arial" w:hAnsi="Arial" w:eastAsia="Arial"/>
-                <w:b w:val="0"/>
-                <w:color w:val="000000"/>
-                <w:sz w:val="16"/>
-              </w:rPr>
-              <w:t>Program directory and responsibility summary.</w:t>
-            </w:r>
-          </w:p>
-        </w:tc>
-      </w:tr>
-      <w:tr>
-        <w:trPr>
-          <w:cantSplit/>
-        </w:trPr>
-        <w:tc>
-          <w:tcPr>
-            <w:tcW w:type="dxa" w:w="3528"/>
-            <w:vAlign w:val="center"/>
-            <w:tcMar>
-              <w:top w:w="85" w:type="dxa"/>
-              <w:start w:w="110" w:type="dxa"/>
-              <w:bottom w:w="85" w:type="dxa"/>
-              <w:end w:w="110" w:type="dxa"/>
-            </w:tcMar>
-          </w:tcPr>
-          <w:p>
-            <w:pPr>
-              <w:spacing w:after="0" w:line="252" w:lineRule="auto"/>
-              <w:jc w:val="left"/>
-            </w:pPr>
-            <w:r>
-              <w:rPr>
-                <w:rFonts w:ascii="Arial" w:hAnsi="Arial" w:eastAsia="Arial"/>
-                <w:b/>
-                <w:color w:val="000000"/>
-                <w:sz w:val="16"/>
-              </w:rPr>
-              <w:t>docs/SHEET_FORMATS.md</w:t>
-            </w:r>
-          </w:p>
-        </w:tc>
-        <w:tc>
-          <w:tcPr>
-            <w:tcW w:type="dxa" w:w="6696"/>
-            <w:vAlign w:val="center"/>
-            <w:tcMar>
-              <w:top w:w="85" w:type="dxa"/>
-              <w:start w:w="110" w:type="dxa"/>
-              <w:bottom w:w="85" w:type="dxa"/>
-              <w:end w:w="110" w:type="dxa"/>
-            </w:tcMar>
-          </w:tcPr>
-          <w:p>
-            <w:pPr>
-              <w:spacing w:after="0" w:line="252" w:lineRule="auto"/>
-              <w:jc w:val="left"/>
-            </w:pPr>
-            <w:r>
-              <w:rPr>
-                <w:rFonts w:ascii="Arial" w:hAnsi="Arial" w:eastAsia="Arial"/>
-                <w:b w:val="0"/>
-                <w:color w:val="000000"/>
-                <w:sz w:val="16"/>
-              </w:rPr>
               <w:t>CompSheet and CueSheet fields and supported formats.</w:t>
-            </w:r>
-          </w:p>
-        </w:tc>
-      </w:tr>
-      <w:tr>
-        <w:trPr>
-          <w:cantSplit/>
-        </w:trPr>
-        <w:tc>
-          <w:tcPr>
-            <w:tcW w:type="dxa" w:w="3528"/>
-            <w:shd w:fill="EEF3F8"/>
-            <w:vAlign w:val="center"/>
-            <w:tcMar>
-              <w:top w:w="85" w:type="dxa"/>
-              <w:start w:w="110" w:type="dxa"/>
-              <w:bottom w:w="85" w:type="dxa"/>
-              <w:end w:w="110" w:type="dxa"/>
-            </w:tcMar>
-          </w:tcPr>
-          <w:p>
-            <w:pPr>
-              <w:spacing w:after="0" w:line="252" w:lineRule="auto"/>
-              <w:jc w:val="left"/>
-            </w:pPr>
-            <w:r>
-              <w:rPr>
-                <w:rFonts w:ascii="Arial" w:hAnsi="Arial" w:eastAsia="Arial"/>
-                <w:b/>
-                <w:color w:val="000000"/>
-                <w:sz w:val="16"/>
-              </w:rPr>
-              <w:t>docs/ben-local-fixes.patch</w:t>
-            </w:r>
-          </w:p>
-        </w:tc>
-        <w:tc>
-          <w:tcPr>
-            <w:tcW w:type="dxa" w:w="6696"/>
-            <w:shd w:fill="EEF3F8"/>
-            <w:vAlign w:val="center"/>
-            <w:tcMar>
-              <w:top w:w="85" w:type="dxa"/>
-              <w:start w:w="110" w:type="dxa"/>
-              <w:bottom w:w="85" w:type="dxa"/>
-              <w:end w:w="110" w:type="dxa"/>
-            </w:tcMar>
-          </w:tcPr>
-          <w:p>
-            <w:pPr>
-              <w:spacing w:after="0" w:line="252" w:lineRule="auto"/>
-              <w:jc w:val="left"/>
-            </w:pPr>
-            <w:r>
-              <w:rPr>
-                <w:rFonts w:ascii="Arial" w:hAnsi="Arial" w:eastAsia="Arial"/>
-                <w:b w:val="0"/>
-                <w:color w:val="000000"/>
-                <w:sz w:val="16"/>
-              </w:rPr>
-              <w:t>Local vendor fixes for upstream review.</w:t>
             </w:r>
           </w:p>
         </w:tc>
@@ -19990,7 +20179,7 @@
           </w:tcPr>
           <w:p>
             <w:r>
-              <w:t>The current 77 tests and all new tests reproduce from a clean environment.</w:t>
+              <w:t xml:space="preserve">The current 126 tests and all new tests reproduce from a clean environment.</w:t>
             </w:r>
           </w:p>
         </w:tc>
@@ -20002,6 +20191,7 @@
         <w:tc>
           <w:tcPr>
             <w:tcW w:type="dxa" w:w="792"/>
+            <w:shd w:fill="EEF3F8"/>
             <w:vAlign w:val="center"/>
             <w:tcMar>
               <w:top w:w="85" w:type="dxa"/>
@@ -20022,6 +20212,122 @@
                 <w:color w:val="000000"/>
                 <w:sz w:val="15"/>
               </w:rPr>
+              <w:t xml:space="preserve">P1</w:t>
+            </w:r>
+          </w:p>
+        </w:tc>
+        <w:tc>
+          <w:tcPr>
+            <w:tcW w:type="dxa" w:w="1944"/>
+            <w:shd w:fill="EEF3F8"/>
+            <w:vAlign w:val="center"/>
+            <w:tcMar>
+              <w:top w:w="85" w:type="dxa"/>
+              <w:start w:w="110" w:type="dxa"/>
+              <w:bottom w:w="85" w:type="dxa"/>
+              <w:end w:w="110" w:type="dxa"/>
+            </w:tcMar>
+          </w:tcPr>
+          <w:p>
+            <w:pPr>
+              <w:spacing w:after="0" w:line="252" w:lineRule="auto"/>
+              <w:jc w:val="left"/>
+            </w:pPr>
+            <w:r>
+              <w:rPr>
+                <w:rFonts w:ascii="Arial" w:hAnsi="Arial" w:eastAsia="Arial"/>
+                <w:b w:val="0"/>
+                <w:color w:val="000000"/>
+                <w:sz w:val="15"/>
+              </w:rPr>
+              <w:t xml:space="preserve">Input-error scoring</w:t>
+            </w:r>
+          </w:p>
+        </w:tc>
+        <w:tc>
+          <w:tcPr>
+            <w:tcW w:type="dxa" w:w="4320"/>
+            <w:shd w:fill="EEF3F8"/>
+            <w:vAlign w:val="center"/>
+            <w:tcMar>
+              <w:top w:w="85" w:type="dxa"/>
+              <w:start w:w="110" w:type="dxa"/>
+              <w:bottom w:w="85" w:type="dxa"/>
+              <w:end w:w="110" w:type="dxa"/>
+            </w:tcMar>
+          </w:tcPr>
+          <w:p>
+            <w:pPr>
+              <w:spacing w:after="0" w:line="252" w:lineRule="auto"/>
+              <w:jc w:val="left"/>
+            </w:pPr>
+            <w:r>
+              <w:rPr>
+                <w:rFonts w:ascii="Arial" w:hAnsi="Arial" w:eastAsia="Arial"/>
+                <w:b w:val="0"/>
+                <w:color w:val="000000"/>
+                <w:sz w:val="15"/>
+              </w:rPr>
+              <w:t xml:space="preserve">Treat isolated objects (hash mismatch, size limit, invalid path, hash or path format errors) as not assessed in BoundFileIntegrityPass instead of failed object_hash_bound checks.</w:t>
+            </w:r>
+          </w:p>
+        </w:tc>
+        <w:tc>
+          <w:tcPr>
+            <w:tcW w:type="dxa" w:w="3168"/>
+            <w:shd w:fill="EEF3F8"/>
+            <w:vAlign w:val="center"/>
+            <w:tcMar>
+              <w:top w:w="85" w:type="dxa"/>
+              <w:start w:w="110" w:type="dxa"/>
+              <w:bottom w:w="85" w:type="dxa"/>
+              <w:end w:w="110" w:type="dxa"/>
+            </w:tcMar>
+          </w:tcPr>
+          <w:p>
+            <w:pPr>
+              <w:spacing w:after="0" w:line="252" w:lineRule="auto"/>
+              <w:jc w:val="left"/>
+            </w:pPr>
+            <w:r>
+              <w:rPr>
+                <w:rFonts w:ascii="Arial" w:hAnsi="Arial" w:eastAsia="Arial"/>
+                <w:b w:val="0"/>
+                <w:color w:val="000000"/>
+                <w:sz w:val="15"/>
+              </w:rPr>
+              <w:t xml:space="preserve">An input error never lowers the file-integrity layer; each isolated case has a regression test.</w:t>
+            </w:r>
+          </w:p>
+        </w:tc>
+      </w:tr>
+      <w:tr>
+        <w:trPr>
+          <w:cantSplit/>
+        </w:trPr>
+        <w:tc>
+          <w:tcPr>
+            <w:tcW w:type="dxa" w:w="792"/>
+            <w:vAlign w:val="center"/>
+            <w:tcMar>
+              <w:top w:w="85" w:type="dxa"/>
+              <w:start w:w="110" w:type="dxa"/>
+              <w:bottom w:w="85" w:type="dxa"/>
+              <w:end w:w="110" w:type="dxa"/>
+            </w:tcMar>
+          </w:tcPr>
+          <w:p>
+            <w:pPr>
+              <w:spacing w:after="0" w:line="252" w:lineRule="auto"/>
+              <w:jc w:val="center"/>
+            </w:pPr>
+            <w:r>
+              <w:rPr>
+                <w:rFonts w:ascii="Arial" w:hAnsi="Arial" w:eastAsia="Arial"/>
+                <w:b w:val="0"/>
+                <w:color w:val="000000"/>
+                <w:sz w:val="15"/>
+              </w:rPr>
               <w:t>P2</w:t>
             </w:r>
           </w:p>
@@ -20076,7 +20382,7 @@
                 <w:color w:val="000000"/>
                 <w:sz w:val="15"/>
               </w:rPr>
-              <w:t>Prioritise FLAC, AIFF, BWF, and RF64 from real customer data.</w:t>
+              <w:t xml:space="preserve">Prioritise FLAC, AIFF, RF64/BW64, and compressed WAV codecs from real customer data; integer and float RIFF/WAVE already share one streaming decoder.</w:t>
             </w:r>
           </w:p>
         </w:tc>
@@ -20868,7 +21174,7 @@
           </w:tcPr>
           <w:p>
             <w:r>
-              <w:t>PCM window cache implemented</w:t>
+              <w:t xml:space="preserve">PCM window and proxy caches implemented</w:t>
             </w:r>
           </w:p>
         </w:tc>
@@ -20886,7 +21192,7 @@
           </w:tcPr>
           <w:p>
             <w:r>
-              <w:t>Edit, Comp, Stem, Mix, and Master derivation classes plus all eight physical-audio diagnostics; cache keys include artefact and decoded time window.</w:t>
+              <w:t xml:space="preserve">Exact derivation classes reuse small decoded windows keyed by artefact and time window; all eight physical-audio diagnostics share one complete-file low-rate proxy per artefact; the WAV descriptor is cached on each artefact.</w:t>
             </w:r>
           </w:p>
         </w:tc>

</xml_diff>

<commit_message>
Add evidence tiers, score explanations, music semantics and DAW evidence
</commit_message>
<xml_diff>
--- a/COMP3888_Music_Evidence_Evaluation_Program_Technical_Manual.docx
+++ b/COMP3888_Music_Evidence_Evaluation_Program_Technical_Manual.docx
@@ -416,7 +416,7 @@
                 <w:color w:val="000000"/>
                 <w:sz w:val="18"/>
               </w:rPr>
-              <w:t>149 tests passed with no failures or skips</w:t>
+              <w:t>189 tests passed with no failures or skips</w:t>
             </w:r>
           </w:p>
         </w:tc>
@@ -11680,7 +11680,7 @@
                 <w:color w:val="000000"/>
                 <w:sz w:val="18"/>
               </w:rPr>
-              <w:t>Chroma, MFCC and energy features, time aggregation, candidate boundaries, sparse recurrence and cross-file feature correspondence.</w:t>
+              <w:t>Chroma, MFCC and energy features, time aggregation, candidate boundaries and sparse recurrence within each file; cross-file similarity is reported only as summary statistics because it did not separate related from unrelated real recordings. A separate report-only music_semantics provider compares key, tempo, beat chords and 16-beat phrase form across versions, with transposition, tempo ratio, harmonic similarity against a beat-shuffled baseline, chord-sequence similarity and phrase order.</w:t>
             </w:r>
           </w:p>
         </w:tc>
@@ -11691,7 +11691,7 @@
         <w:spacing w:before="120"/>
       </w:pPr>
       <w:r>
-        <w:t>The providers analyse only retained, declared audio-to-audio relationships with usable core-bound files. CompSheet tasks require matching source/target selections. Supplied range analysis requires all four endpoints. Estimates are returned in original-file seconds and never replace edge parameters. Silence, channel cancellation and insufficient signal are diagnostic limitations, not contradictions.</w:t>
+        <w:t>The providers analyse only retained, declared audio-to-audio relationships with usable core-bound files. CompSheet tasks require matching source/target selections. A selection without target_end_seconds copies its declared source span and is flagged range_source derived_from_declared_source_duration; other supplied ranges require all four endpoints. Estimates are returned in original-file seconds and never replace edge parameters. Silence, channel cancellation and insufficient signal are diagnostic limitations, not contradictions.</w:t>
       </w:r>
     </w:p>
     <w:p>
@@ -11708,7 +11708,7 @@
     <w:p>
       <w:pPr/>
       <w:r>
-        <w:t>The parent retains the completed core response, verifies temporary WAV snapshots and launches isolated provider workers. Snapshots are rehashed and reused during that invocation. Provider exceptions, missing optional packages, invalid policies and caller-time exhaustion append unavailable observations without changing the retained axes or original core findings. A crashed provider’s diagnostic includes the tail of its stderr; a protocol-breaking result or a worker that cannot start affects only its own task and provider.</w:t>
+        <w:t>The parent retains the completed core response, verifies temporary WAV snapshots and launches one isolated worker per task, which runs every provider in turn, decodes each file range once and streams one result per provider, so results finished before a timeout or crash are kept. Snapshots are rehashed and reused during that invocation. Provider exceptions, missing optional packages, invalid policies and caller-time exhaustion append unavailable observations without changing the retained axes or original core findings. A crashed provider’s diagnostic includes the tail of its stderr; a protocol-breaking result or a worker that cannot start affects only its own task and provider.</w:t>
       </w:r>
     </w:p>
     <w:p>
@@ -11808,7 +11808,7 @@
     <w:p>
       <w:pPr/>
       <w:r>
-        <w:t>Every diagnostic fixes scoring_eligible to false, integrity_contribution to null and content_match_is_provenance to false. Current candidate thresholds are uncalibrated: completed analysis is inconclusive, even when matches exist; an analysis that cannot run is unavailable. The three measurements are not independent votes and are never averaged into a provenance score. The old physical_similarity placeholders continue to identify the disabled legacy layer.</w:t>
+        <w:t>Every diagnostic fixes scoring_eligible to false, integrity_contribution to null and content_match_is_provenance to false. Current candidate thresholds are uncalibrated: completed analysis is inconclusive, even when matches exist; an analysis that cannot run is unavailable. The measurements are never averaged into a provenance score. A report-only fingerprint_agreement row lists offsets where audfprint and SpectroMap both voted, including sub-threshold votes, with a Poisson chance estimate; both read the same audio, so agreement is not independent evidence. A graph without audio-to-audio relationships yields one AUDIO_DIAGNOSTIC_NOT_APPLICABLE finding. The old physical_similarity placeholders continue to identify the disabled legacy layer.</w:t>
       </w:r>
     </w:p>
     <w:p>
@@ -11825,7 +11825,7 @@
     <w:p>
       <w:pPr/>
       <w:r>
-        <w:t>Verification on 18 October 2026 passed 124 core tests and 25 diagnostic tests, with no failures or skips. Real installed backends completed the generated repeated-excerpt example. audfprint found offsets near 2.00 and 10.01 seconds; SpectroMap found offsets near 2.00 and 9.996 seconds; librosa returned structure, repetitions and feature correspondences. Enabled and disabled runs retained identical four-axis values and original findings. A 20-second excerpt in a 3-minute source is a regression test: whole-file SpectroMap peak search aligned about 3% of the excerpt’s peak pairs, while the windowed search aligns about 62%. These are engineering results; real-session accuracy and thresholds still need labelled data.</w:t>
+        <w:t>Verification on 18 October 2026 passed 127 core tests, 34 diagnostic tests and 9 production-document tests, with no failures or skips. Real installed backends completed the generated repeated-excerpt example. audfprint found offsets near 2.00 and 10.01 seconds; SpectroMap found offsets near 2.00 and 9.996 seconds; librosa returned structure, repetitions and feature correspondences. Enabled and disabled runs retained identical four-axis values and original findings. A 20-second excerpt in a 3-minute source is a regression test: whole-file SpectroMap peak search aligned about 3% of the excerpt’s peak pairs, while the windowed search aligns about 62%. These are engineering results; real-session accuracy and thresholds still need labelled data.</w:t>
       </w:r>
     </w:p>
     <w:p>
@@ -13121,7 +13121,7 @@
           <w:color w:val="000000"/>
           <w:sz w:val="21"/>
         </w:rPr>
-        <w:t>The active policies/scoring_profile.json combines the available file_integrity, declaration_consistency and cross_evidence_support layers using positive configured weights, each 1.0 by default. The default withholding rule requires at least two populated layers including CrossEvidence, unless an assessed contradiction permits a numeric result. Confidence is 0.8 multiplied by populated layers divided by 3. If an aggregated failed check matches severe_contradiction_rules, the value becomes min(weighted_mean, 0.25); the ceiling never raises a lower value. When the cap applies, the Integrity reasoning names the triggering rule(s) and the uncapped weighted mean, and assessment_checks.severe_contradiction_cap records the cap, triggered rules, weighted mean, final value and whether the value was lowered. The current severe rules cover object hash binding, RIN and ERN audio bindings, C2PA ingredient and standalone-manifest bindings, and CompSheet selection-to-edge consistency. Input errors that stop core execution return no score. Audio candidates neither contribute to the mean nor trigger or cancel the cap. Real-evidence validation of these policy parameters remains future work.</w:t>
+        <w:t>The active policies/scoring_profile.json combines the available file_integrity, declaration_consistency and cross_evidence_support layers using positive configured weights, each 1.0 by default. Profile default-v2 tags every cross-evidence check with an evidence_tier: signed_attestation (validated C2PA), recorder_metadata (sound report or AAF compared with BWF bext/iXML written by the recorder into a hash-bound WAV) or submitter_document (RIN, ERN, CompSheet, CueSheet, MIDI, AAF, sound report or unverified C2PA alone). The default withholding rule requires at least two populated layers and an assessed check from an independent tier, unless an assessed contradiction permits a numeric result; submitter documents corroborate but cannot release a value on their own. Confidence is 0.8 multiplied by populated layers divided by 3. If an aggregated failed check matches severe_contradiction_rules, the value becomes min(weighted_mean, 0.25); the ceiling never raises a lower value. When the cap applies, the Integrity reasoning names the triggering rule(s) and the uncapped weighted mean, and assessment_checks.severe_contradiction_cap records the cap, triggered rules, weighted mean, final value and whether the value was lowered. The current severe rules cover object hash binding, RIN and ERN audio bindings, C2PA ingredient and standalone-manifest bindings, and CompSheet selection-to-edge consistency. Input errors that stop core execution return no score. Every successful response carries assessment_checks.score_explanations, one entry per axis, listing layers, weights, the weighted mean, whether a cap applied or a value was withheld, and every failed check as a sentence with its compared values (for example a 2.00 s gap between a sound report and the recorder timecode); a timecode mismatch is an ordinary, explained contradiction rather than a severe rule. Evidence the selected workflow does not describe is reported as inconclusive (WORKFLOW_EVIDENCE_OUTSIDE_POLICY) and does not change completeness. Ableton Live sessions (project/daw-session) are parsed and checked, as submitter documents, for the declared source audio, MIDI tempo and time signature. Audio candidates neither contribute to the mean nor trigger or cancel the cap. Real-evidence validation of these policy parameters remains future work.</w:t>
       </w:r>
     </w:p>
     <w:p>
@@ -19970,7 +19970,7 @@
                 <w:color w:val="000000"/>
                 <w:sz w:val="18"/>
               </w:rPr>
-              <w:t>25 tests including real providers, repeated positions, a 3-minute long-source excerpt, length-independent SpectroMap peak density, time restoration, failure isolation and stderr reporting, snapshots and unchanged core results.</w:t>
+              <w:t>34 tests including the per-task worker, fingerprint agreement, CompSheet end derivation, real providers, repeated positions, a 3-minute long-source excerpt, length-independent SpectroMap peak density, time restoration, failure isolation and stderr reporting, snapshots and unchanged core results.</w:t>
             </w:r>
           </w:p>
         </w:tc>
@@ -20092,7 +20092,7 @@
                 <w:color w:val="000000"/>
                 <w:sz w:val="18"/>
               </w:rPr>
-              <w:t>18 October 2026 record: 149 passed, no failures or skips; three real providers complete and core axes/findings unchanged.</w:t>
+              <w:t>19 October 2026 record: 189 passed, no failures or skips; three real providers complete and core axes/findings unchanged.</w:t>
             </w:r>
           </w:p>
         </w:tc>
@@ -20192,7 +20192,7 @@
           <w:color w:val="000000"/>
           <w:sz w:val="21"/>
         </w:rPr>
-        <w:t>The next priority is real-session validation of the three report-only providers, including repeated content, processing, misleading source direction and unrelated material. The 18 October 2026 integration passed 149 engineering tests and retained identical core results on the generated example. This does not establish real-recording accuracy. Matching thresholds need calibration before stronger diagnostic labels are introduced; existing scoring weights and the cap remain separate policy decisions.</w:t>
+        <w:t>The next priority is real-session validation of the three report-only providers, including repeated content, processing, misleading source direction and unrelated material. The 18 October 2026 integration passed 189 engineering tests and retained identical core results on the generated example. This does not establish real-recording accuracy. Matching thresholds need calibration before stronger diagnostic labels are introduced; existing scoring weights and the cap remain separate policy decisions.</w:t>
       </w:r>
     </w:p>
     <w:tbl>
@@ -21360,7 +21360,7 @@
                 <w:color w:val="000000"/>
                 <w:sz w:val="18"/>
               </w:rPr>
-              <w:t>Reproduce the dependency lock and profile real recordings with all three optional providers.</w:t>
+              <w:t>Reproduce the dependency lock and profile real recordings with the optional providers, and run benchmarks/music_benchmark.py on BabySlakh, Slakh2100 or MUSDB18-HQ to calibrate thresholds with true and control stems.</w:t>
             </w:r>
           </w:p>
         </w:tc>
@@ -21388,7 +21388,7 @@
                 <w:color w:val="000000"/>
                 <w:sz w:val="18"/>
               </w:rPr>
-              <w:t>All 149 tests pass; runtime and memory are measured without silently truncating files.</w:t>
+              <w:t>All 189 tests pass; runtime and memory are measured without silently truncating files.</w:t>
             </w:r>
           </w:p>
         </w:tc>

</xml_diff>